<commit_message>
chore(longform): supervise the autopilot driver and refresh the new-book guide
Add the /opt/auto_guard.sh supervisor plus three stop-only safeguards (identical decision with no progress 3x, 24 paid steps without a new accepted chapter, same halt twice), clean 9 GB of stale docker images on the ECS, and rebuild the usage guide with the server-side autopilot chapter.
</commit_message>
<xml_diff>
--- a/docs/通用长篇新书使用指南.docx
+++ b/docs/通用长篇新书使用指南.docx
@@ -42,7 +42,7 @@
           <w:color w:val="1A1A1A"/>
           <w:sz w:val="19"/>
         </w:rPr>
-        <w:t>本指南对应线上版本 70409dd 的功能，包含来源策略开关、自动连跑，以及 2026-09-23 修好的三处验收卡点。</w:t>
+        <w:t>本指南对应 2026-09-24 的线上版本：服务端自动连跑（v5 守护脚本）、检索签名复用、生成上下文投影。它讲的是从一条链接开始，到一整本十万字长篇完稿、拿到 Word 的全过程。</w:t>
       </w:r>
     </w:p>
     <w:p>
@@ -3181,6 +3181,1156 @@
           <w:color w:val="000000"/>
           <w:sz w:val="30"/>
         </w:rPr>
+        <w:t>第七步 服务端自动连跑（无人值守，推荐）</w:t>
+      </w:r>
+    </w:p>
+    <w:p>
+      <w:pPr>
+        <w:spacing w:after="120"/>
+      </w:pPr>
+      <w:r>
+        <w:rPr>
+          <w:rFonts w:ascii="微软雅黑" w:hAnsi="微软雅黑" w:eastAsia="微软雅黑"/>
+          <w:b w:val="0"/>
+          <w:color w:val="1A1A1A"/>
+          <w:sz w:val="21"/>
+        </w:rPr>
+        <w:t>从 2026-09-24 起，让它自己往下走这件事由服务端接管：ECS 上的守护脚本 /opt/auto_guard.sh 拉起 /opt/auto_driver.sh，在任务真正空闲时用与工作区按钮完全相同的动作接口提交下一步，逐章推进到第 13 章全部验收，再自动进入全书终审、字数校验与合稿 Word。页面上的自动连跑开关保持关闭即可：它现在只是人工兜底的备用入口，不再是整本书必须点开的东西。</w:t>
+      </w:r>
+    </w:p>
+    <w:p>
+      <w:pPr>
+        <w:pStyle w:val="Heading2"/>
+        <w:spacing w:before="240" w:after="120"/>
+      </w:pPr>
+      <w:r>
+        <w:rPr>
+          <w:rFonts w:ascii="微软雅黑" w:hAnsi="微软雅黑" w:eastAsia="微软雅黑"/>
+          <w:b/>
+          <w:color w:val="000000"/>
+          <w:sz w:val="25"/>
+        </w:rPr>
+        <w:t>它每一步做什么</w:t>
+      </w:r>
+    </w:p>
+    <w:p>
+      <w:pPr>
+        <w:pStyle w:val="ListNumber"/>
+        <w:spacing w:after="60"/>
+      </w:pPr>
+      <w:r>
+        <w:rPr>
+          <w:rFonts w:ascii="微软雅黑" w:hAnsi="微软雅黑" w:eastAsia="微软雅黑"/>
+          <w:b w:val="0"/>
+          <w:color w:val="1A1A1A"/>
+          <w:sz w:val="21"/>
+        </w:rPr>
+        <w:t>读状态：先确认任务空闲（pending / processing 一律当忙，绝不并发），并检查计费熔断开关。</w:t>
+      </w:r>
+    </w:p>
+    <w:p>
+      <w:pPr>
+        <w:pStyle w:val="ListNumber"/>
+        <w:spacing w:after="60"/>
+      </w:pPr>
+      <w:r>
+        <w:rPr>
+          <w:rFonts w:ascii="微软雅黑" w:hAnsi="微软雅黑" w:eastAsia="微软雅黑"/>
+          <w:b w:val="0"/>
+          <w:color w:val="1A1A1A"/>
+          <w:sz w:val="21"/>
+        </w:rPr>
+        <w:t>选题与大纲：需要联网检索时，按页面上允许自动重新联网检索的开关决定直接开检索，还是停下来等你点。</w:t>
+      </w:r>
+    </w:p>
+    <w:p>
+      <w:pPr>
+        <w:pStyle w:val="ListNumber"/>
+        <w:spacing w:after="60"/>
+      </w:pPr>
+      <w:r>
+        <w:rPr>
+          <w:rFonts w:ascii="微软雅黑" w:hAnsi="微软雅黑" w:eastAsia="微软雅黑"/>
+          <w:b w:val="0"/>
+          <w:color w:val="1A1A1A"/>
+          <w:sz w:val="21"/>
+        </w:rPr>
+        <w:t>确认大纲：结构校验通过后按推荐方案自动确认，不擅自改你选中的包装方案。</w:t>
+      </w:r>
+    </w:p>
+    <w:p>
+      <w:pPr>
+        <w:pStyle w:val="ListNumber"/>
+        <w:spacing w:after="60"/>
+      </w:pPr>
+      <w:r>
+        <w:rPr>
+          <w:rFonts w:ascii="微软雅黑" w:hAnsi="微软雅黑" w:eastAsia="微软雅黑"/>
+          <w:b w:val="0"/>
+          <w:color w:val="1A1A1A"/>
+          <w:sz w:val="21"/>
+        </w:rPr>
+        <w:t>逐章写作：第 N 章 → 章节检索 → 证据抽取 → 分小节初稿 → 润色复核 → 验收 →（有问题）一次局部修订 → 复验 → 通过后落盘 canon 状态 → 第 N+1 章。严格串行，任何时候只有一章在写。</w:t>
+      </w:r>
+    </w:p>
+    <w:p>
+      <w:pPr>
+        <w:pStyle w:val="ListNumber"/>
+        <w:spacing w:after="60"/>
+      </w:pPr>
+      <w:r>
+        <w:rPr>
+          <w:rFonts w:ascii="微软雅黑" w:hAnsi="微软雅黑" w:eastAsia="微软雅黑"/>
+          <w:b w:val="0"/>
+          <w:color w:val="1A1A1A"/>
+          <w:sz w:val="21"/>
+        </w:rPr>
+        <w:t>全书终审与合稿：13 章齐了以后跑终审；字数不在 100000—110000 或终审报了高/严重问题，会自动生成一次局部修订再复验，通过后输出整本 Word 与 manuscript.md。</w:t>
+      </w:r>
+    </w:p>
+    <w:p>
+      <w:pPr>
+        <w:pStyle w:val="Heading2"/>
+        <w:spacing w:before="240" w:after="120"/>
+      </w:pPr>
+      <w:r>
+        <w:rPr>
+          <w:rFonts w:ascii="微软雅黑" w:hAnsi="微软雅黑" w:eastAsia="微软雅黑"/>
+          <w:b/>
+          <w:color w:val="000000"/>
+          <w:sz w:val="25"/>
+        </w:rPr>
+        <w:t>三重安全阀：不会闷头烧钱</w:t>
+      </w:r>
+    </w:p>
+    <w:tbl>
+      <w:tblPr>
+        <w:tblStyle w:val="TableGrid"/>
+        <w:tblW w:type="auto" w:w="0"/>
+        <w:jc w:val="center"/>
+        <w:tblLayout w:type="fixed"/>
+        <w:tblLook w:firstColumn="1" w:firstRow="1" w:lastColumn="0" w:lastRow="0" w:noHBand="0" w:noVBand="1" w:val="04A0"/>
+      </w:tblPr>
+      <w:tblGrid>
+        <w:gridCol w:w="3213"/>
+        <w:gridCol w:w="3213"/>
+        <w:gridCol w:w="3213"/>
+      </w:tblGrid>
+      <w:tr>
+        <w:tc>
+          <w:tcPr>
+            <w:tcW w:type="dxa" w:w="1814"/>
+          </w:tcPr>
+          <w:p>
+            <w:pPr>
+              <w:spacing w:after="40"/>
+            </w:pPr>
+            <w:r/>
+            <w:r>
+              <w:rPr>
+                <w:rFonts w:ascii="微软雅黑" w:hAnsi="微软雅黑" w:eastAsia="微软雅黑"/>
+                <w:b/>
+                <w:color w:val="1A1A1A"/>
+                <w:sz w:val="18"/>
+              </w:rPr>
+              <w:t>安全阀</w:t>
+            </w:r>
+          </w:p>
+        </w:tc>
+        <w:tc>
+          <w:tcPr>
+            <w:tcW w:type="dxa" w:w="4762"/>
+          </w:tcPr>
+          <w:p>
+            <w:pPr>
+              <w:spacing w:after="40"/>
+            </w:pPr>
+            <w:r/>
+            <w:r>
+              <w:rPr>
+                <w:rFonts w:ascii="微软雅黑" w:hAnsi="微软雅黑" w:eastAsia="微软雅黑"/>
+                <w:b/>
+                <w:color w:val="1A1A1A"/>
+                <w:sz w:val="18"/>
+              </w:rPr>
+              <w:t>触发条件</w:t>
+            </w:r>
+          </w:p>
+        </w:tc>
+        <w:tc>
+          <w:tcPr>
+            <w:tcW w:type="dxa" w:w="3061"/>
+          </w:tcPr>
+          <w:p>
+            <w:pPr>
+              <w:spacing w:after="40"/>
+            </w:pPr>
+            <w:r/>
+            <w:r>
+              <w:rPr>
+                <w:rFonts w:ascii="微软雅黑" w:hAnsi="微软雅黑" w:eastAsia="微软雅黑"/>
+                <w:b/>
+                <w:color w:val="1A1A1A"/>
+                <w:sz w:val="18"/>
+              </w:rPr>
+              <w:t>它的动作</w:t>
+            </w:r>
+          </w:p>
+        </w:tc>
+      </w:tr>
+      <w:tr>
+        <w:tc>
+          <w:tcPr>
+            <w:tcW w:type="dxa" w:w="1814"/>
+          </w:tcPr>
+          <w:p>
+            <w:pPr>
+              <w:spacing w:after="40"/>
+            </w:pPr>
+            <w:r/>
+            <w:r>
+              <w:rPr>
+                <w:rFonts w:ascii="微软雅黑" w:hAnsi="微软雅黑" w:eastAsia="微软雅黑"/>
+                <w:b w:val="0"/>
+                <w:color w:val="1A1A1A"/>
+                <w:sz w:val="18"/>
+              </w:rPr>
+              <w:t>同一决策去重</w:t>
+            </w:r>
+          </w:p>
+        </w:tc>
+        <w:tc>
+          <w:tcPr>
+            <w:tcW w:type="dxa" w:w="4762"/>
+          </w:tcPr>
+          <w:p>
+            <w:pPr>
+              <w:spacing w:after="40"/>
+            </w:pPr>
+            <w:r/>
+            <w:r>
+              <w:rPr>
+                <w:rFonts w:ascii="微软雅黑" w:hAnsi="微软雅黑" w:eastAsia="微软雅黑"/>
+                <w:b w:val="0"/>
+                <w:color w:val="1A1A1A"/>
+                <w:sz w:val="18"/>
+              </w:rPr>
+              <w:t>连续 3 次算出同一动作且进度指纹毫无变化（没有任何新章通过验收）</w:t>
+            </w:r>
+          </w:p>
+        </w:tc>
+        <w:tc>
+          <w:tcPr>
+            <w:tcW w:type="dxa" w:w="3061"/>
+          </w:tcPr>
+          <w:p>
+            <w:pPr>
+              <w:spacing w:after="40"/>
+            </w:pPr>
+            <w:r/>
+            <w:r>
+              <w:rPr>
+                <w:rFonts w:ascii="微软雅黑" w:hAnsi="微软雅黑" w:eastAsia="微软雅黑"/>
+                <w:b w:val="0"/>
+                <w:color w:val="1A1A1A"/>
+                <w:sz w:val="18"/>
+              </w:rPr>
+              <w:t>立刻停机，不再提交，等人</w:t>
+            </w:r>
+          </w:p>
+        </w:tc>
+      </w:tr>
+      <w:tr>
+        <w:tc>
+          <w:tcPr>
+            <w:tcW w:type="dxa" w:w="1814"/>
+          </w:tcPr>
+          <w:p>
+            <w:pPr>
+              <w:spacing w:after="40"/>
+            </w:pPr>
+            <w:r/>
+            <w:r>
+              <w:rPr>
+                <w:rFonts w:ascii="微软雅黑" w:hAnsi="微软雅黑" w:eastAsia="微软雅黑"/>
+                <w:b w:val="0"/>
+                <w:color w:val="1A1A1A"/>
+                <w:sz w:val="18"/>
+              </w:rPr>
+              <w:t>无进展停机</w:t>
+            </w:r>
+          </w:p>
+        </w:tc>
+        <w:tc>
+          <w:tcPr>
+            <w:tcW w:type="dxa" w:w="4762"/>
+          </w:tcPr>
+          <w:p>
+            <w:pPr>
+              <w:spacing w:after="40"/>
+            </w:pPr>
+            <w:r/>
+            <w:r>
+              <w:rPr>
+                <w:rFonts w:ascii="微软雅黑" w:hAnsi="微软雅黑" w:eastAsia="微软雅黑"/>
+                <w:b w:val="0"/>
+                <w:color w:val="1A1A1A"/>
+                <w:sz w:val="18"/>
+              </w:rPr>
+              <w:t>连续 24 次付费步进仍没有新的章节通过验收（正常一章约 8—12 步）</w:t>
+            </w:r>
+          </w:p>
+        </w:tc>
+        <w:tc>
+          <w:tcPr>
+            <w:tcW w:type="dxa" w:w="3061"/>
+          </w:tcPr>
+          <w:p>
+            <w:pPr>
+              <w:spacing w:after="40"/>
+            </w:pPr>
+            <w:r/>
+            <w:r>
+              <w:rPr>
+                <w:rFonts w:ascii="微软雅黑" w:hAnsi="微软雅黑" w:eastAsia="微软雅黑"/>
+                <w:b w:val="0"/>
+                <w:color w:val="1A1A1A"/>
+                <w:sz w:val="18"/>
+              </w:rPr>
+              <w:t>立刻停机，等人</w:t>
+            </w:r>
+          </w:p>
+        </w:tc>
+      </w:tr>
+      <w:tr>
+        <w:tc>
+          <w:tcPr>
+            <w:tcW w:type="dxa" w:w="1814"/>
+          </w:tcPr>
+          <w:p>
+            <w:pPr>
+              <w:spacing w:after="40"/>
+            </w:pPr>
+            <w:r/>
+            <w:r>
+              <w:rPr>
+                <w:rFonts w:ascii="微软雅黑" w:hAnsi="微软雅黑" w:eastAsia="微软雅黑"/>
+                <w:b w:val="0"/>
+                <w:color w:val="1A1A1A"/>
+                <w:sz w:val="18"/>
+              </w:rPr>
+              <w:t>停机去重</w:t>
+            </w:r>
+          </w:p>
+        </w:tc>
+        <w:tc>
+          <w:tcPr>
+            <w:tcW w:type="dxa" w:w="4762"/>
+          </w:tcPr>
+          <w:p>
+            <w:pPr>
+              <w:spacing w:after="40"/>
+            </w:pPr>
+            <w:r/>
+            <w:r>
+              <w:rPr>
+                <w:rFonts w:ascii="微软雅黑" w:hAnsi="微软雅黑" w:eastAsia="微软雅黑"/>
+                <w:b w:val="0"/>
+                <w:color w:val="1A1A1A"/>
+                <w:sz w:val="18"/>
+              </w:rPr>
+              <w:t>守护脚本发现同样的停机信号连续出现两次</w:t>
+            </w:r>
+          </w:p>
+        </w:tc>
+        <w:tc>
+          <w:tcPr>
+            <w:tcW w:type="dxa" w:w="3061"/>
+          </w:tcPr>
+          <w:p>
+            <w:pPr>
+              <w:spacing w:after="40"/>
+            </w:pPr>
+            <w:r/>
+            <w:r>
+              <w:rPr>
+                <w:rFonts w:ascii="微软雅黑" w:hAnsi="微软雅黑" w:eastAsia="微软雅黑"/>
+                <w:b w:val="0"/>
+                <w:color w:val="1A1A1A"/>
+                <w:sz w:val="18"/>
+              </w:rPr>
+              <w:t>整个自动连跑下线，不再重启</w:t>
+            </w:r>
+          </w:p>
+        </w:tc>
+      </w:tr>
+    </w:tbl>
+    <w:p>
+      <w:pPr>
+        <w:spacing w:after="40"/>
+      </w:pPr>
+    </w:p>
+    <w:p>
+      <w:pPr>
+        <w:spacing w:after="160"/>
+      </w:pPr>
+      <w:r>
+        <w:rPr>
+          <w:rFonts w:ascii="微软雅黑" w:hAnsi="微软雅黑" w:eastAsia="微软雅黑"/>
+          <w:b w:val="0"/>
+          <w:color w:val="1A1A1A"/>
+          <w:sz w:val="21"/>
+        </w:rPr>
+        <w:t>三条阀都只会停，不会自动重放会花钱的请求。停机现场完好地留在 state.json 与 /opt/auto_driver.log 里，看一眼就能接着走。</w:t>
+      </w:r>
+    </w:p>
+    <w:p>
+      <w:pPr>
+        <w:pStyle w:val="Heading2"/>
+        <w:spacing w:before="240" w:after="120"/>
+      </w:pPr>
+      <w:r>
+        <w:rPr>
+          <w:rFonts w:ascii="微软雅黑" w:hAnsi="微软雅黑" w:eastAsia="微软雅黑"/>
+          <w:b/>
+          <w:color w:val="000000"/>
+          <w:sz w:val="25"/>
+        </w:rPr>
+        <w:t>停下来的时候，谁在等什么</w:t>
+      </w:r>
+    </w:p>
+    <w:tbl>
+      <w:tblPr>
+        <w:tblStyle w:val="TableGrid"/>
+        <w:tblW w:type="auto" w:w="0"/>
+        <w:jc w:val="center"/>
+        <w:tblLayout w:type="fixed"/>
+        <w:tblLook w:firstColumn="1" w:firstRow="1" w:lastColumn="0" w:lastRow="0" w:noHBand="0" w:noVBand="1" w:val="04A0"/>
+      </w:tblPr>
+      <w:tblGrid>
+        <w:gridCol w:w="3213"/>
+        <w:gridCol w:w="3213"/>
+        <w:gridCol w:w="3213"/>
+      </w:tblGrid>
+      <w:tr>
+        <w:tc>
+          <w:tcPr>
+            <w:tcW w:type="dxa" w:w="2268"/>
+          </w:tcPr>
+          <w:p>
+            <w:pPr>
+              <w:spacing w:after="40"/>
+            </w:pPr>
+            <w:r/>
+            <w:r>
+              <w:rPr>
+                <w:rFonts w:ascii="微软雅黑" w:hAnsi="微软雅黑" w:eastAsia="微软雅黑"/>
+                <w:b/>
+                <w:color w:val="1A1A1A"/>
+                <w:sz w:val="18"/>
+              </w:rPr>
+              <w:t>你看到的</w:t>
+            </w:r>
+          </w:p>
+        </w:tc>
+        <w:tc>
+          <w:tcPr>
+            <w:tcW w:type="dxa" w:w="3969"/>
+          </w:tcPr>
+          <w:p>
+            <w:pPr>
+              <w:spacing w:after="40"/>
+            </w:pPr>
+            <w:r/>
+            <w:r>
+              <w:rPr>
+                <w:rFonts w:ascii="微软雅黑" w:hAnsi="微软雅黑" w:eastAsia="微软雅黑"/>
+                <w:b/>
+                <w:color w:val="1A1A1A"/>
+                <w:sz w:val="18"/>
+              </w:rPr>
+              <w:t>真实含义</w:t>
+            </w:r>
+          </w:p>
+        </w:tc>
+        <w:tc>
+          <w:tcPr>
+            <w:tcW w:type="dxa" w:w="3402"/>
+          </w:tcPr>
+          <w:p>
+            <w:pPr>
+              <w:spacing w:after="40"/>
+            </w:pPr>
+            <w:r/>
+            <w:r>
+              <w:rPr>
+                <w:rFonts w:ascii="微软雅黑" w:hAnsi="微软雅黑" w:eastAsia="微软雅黑"/>
+                <w:b/>
+                <w:color w:val="1A1A1A"/>
+                <w:sz w:val="18"/>
+              </w:rPr>
+              <w:t>你要做的</w:t>
+            </w:r>
+          </w:p>
+        </w:tc>
+      </w:tr>
+      <w:tr>
+        <w:tc>
+          <w:tcPr>
+            <w:tcW w:type="dxa" w:w="2268"/>
+          </w:tcPr>
+          <w:p>
+            <w:pPr>
+              <w:spacing w:after="40"/>
+            </w:pPr>
+            <w:r/>
+            <w:r>
+              <w:rPr>
+                <w:rFonts w:ascii="微软雅黑" w:hAnsi="微软雅黑" w:eastAsia="微软雅黑"/>
+                <w:b w:val="0"/>
+                <w:color w:val="1A1A1A"/>
+                <w:sz w:val="18"/>
+              </w:rPr>
+              <w:t>同一决策重复，已停机</w:t>
+            </w:r>
+          </w:p>
+        </w:tc>
+        <w:tc>
+          <w:tcPr>
+            <w:tcW w:type="dxa" w:w="3969"/>
+          </w:tcPr>
+          <w:p>
+            <w:pPr>
+              <w:spacing w:after="40"/>
+            </w:pPr>
+            <w:r/>
+            <w:r>
+              <w:rPr>
+                <w:rFonts w:ascii="微软雅黑" w:hAnsi="微软雅黑" w:eastAsia="微软雅黑"/>
+                <w:b w:val="0"/>
+                <w:color w:val="1A1A1A"/>
+                <w:sz w:val="18"/>
+              </w:rPr>
+              <w:t>模型连续给出同一步而正文没有推进，通常是被同一条验收问题卡住</w:t>
+            </w:r>
+          </w:p>
+        </w:tc>
+        <w:tc>
+          <w:tcPr>
+            <w:tcW w:type="dxa" w:w="3402"/>
+          </w:tcPr>
+          <w:p>
+            <w:pPr>
+              <w:spacing w:after="40"/>
+            </w:pPr>
+            <w:r/>
+            <w:r>
+              <w:rPr>
+                <w:rFonts w:ascii="微软雅黑" w:hAnsi="微软雅黑" w:eastAsia="微软雅黑"/>
+                <w:b w:val="0"/>
+                <w:color w:val="1A1A1A"/>
+                <w:sz w:val="18"/>
+              </w:rPr>
+              <w:t>读一遍验收报告里那条问题，回我一句你的判断；或直接点一次局部修订</w:t>
+            </w:r>
+          </w:p>
+        </w:tc>
+      </w:tr>
+      <w:tr>
+        <w:tc>
+          <w:tcPr>
+            <w:tcW w:type="dxa" w:w="2268"/>
+          </w:tcPr>
+          <w:p>
+            <w:pPr>
+              <w:spacing w:after="40"/>
+            </w:pPr>
+            <w:r/>
+            <w:r>
+              <w:rPr>
+                <w:rFonts w:ascii="微软雅黑" w:hAnsi="微软雅黑" w:eastAsia="微软雅黑"/>
+                <w:b w:val="0"/>
+                <w:color w:val="1A1A1A"/>
+                <w:sz w:val="18"/>
+              </w:rPr>
+              <w:t>付费步进无进展，已停机</w:t>
+            </w:r>
+          </w:p>
+        </w:tc>
+        <w:tc>
+          <w:tcPr>
+            <w:tcW w:type="dxa" w:w="3969"/>
+          </w:tcPr>
+          <w:p>
+            <w:pPr>
+              <w:spacing w:after="40"/>
+            </w:pPr>
+            <w:r/>
+            <w:r>
+              <w:rPr>
+                <w:rFonts w:ascii="微软雅黑" w:hAnsi="微软雅黑" w:eastAsia="微软雅黑"/>
+                <w:b w:val="0"/>
+                <w:color w:val="1A1A1A"/>
+                <w:sz w:val="18"/>
+              </w:rPr>
+              <w:t>烧了 24 步还没写出一章，属于真卡死</w:t>
+            </w:r>
+          </w:p>
+        </w:tc>
+        <w:tc>
+          <w:tcPr>
+            <w:tcW w:type="dxa" w:w="3402"/>
+          </w:tcPr>
+          <w:p>
+            <w:pPr>
+              <w:spacing w:after="40"/>
+            </w:pPr>
+            <w:r/>
+            <w:r>
+              <w:rPr>
+                <w:rFonts w:ascii="微软雅黑" w:hAnsi="微软雅黑" w:eastAsia="微软雅黑"/>
+                <w:b w:val="0"/>
+                <w:color w:val="1A1A1A"/>
+                <w:sz w:val="18"/>
+              </w:rPr>
+              <w:t>回我一句看断点</w:t>
+            </w:r>
+          </w:p>
+        </w:tc>
+      </w:tr>
+      <w:tr>
+        <w:tc>
+          <w:tcPr>
+            <w:tcW w:type="dxa" w:w="2268"/>
+          </w:tcPr>
+          <w:p>
+            <w:pPr>
+              <w:spacing w:after="40"/>
+            </w:pPr>
+            <w:r/>
+            <w:r>
+              <w:rPr>
+                <w:rFonts w:ascii="微软雅黑" w:hAnsi="微软雅黑" w:eastAsia="微软雅黑"/>
+                <w:b w:val="0"/>
+                <w:color w:val="1A1A1A"/>
+                <w:sz w:val="18"/>
+              </w:rPr>
+              <w:t>需要一次新的全网检索</w:t>
+            </w:r>
+          </w:p>
+        </w:tc>
+        <w:tc>
+          <w:tcPr>
+            <w:tcW w:type="dxa" w:w="3969"/>
+          </w:tcPr>
+          <w:p>
+            <w:pPr>
+              <w:spacing w:after="40"/>
+            </w:pPr>
+            <w:r/>
+            <w:r>
+              <w:rPr>
+                <w:rFonts w:ascii="微软雅黑" w:hAnsi="微软雅黑" w:eastAsia="微软雅黑"/>
+                <w:b w:val="0"/>
+                <w:color w:val="1A1A1A"/>
+                <w:sz w:val="18"/>
+              </w:rPr>
+              <w:t>自动连跑没有检索权限，或断点里没有可复用的检索证据</w:t>
+            </w:r>
+          </w:p>
+        </w:tc>
+        <w:tc>
+          <w:tcPr>
+            <w:tcW w:type="dxa" w:w="3402"/>
+          </w:tcPr>
+          <w:p>
+            <w:pPr>
+              <w:spacing w:after="40"/>
+            </w:pPr>
+            <w:r/>
+            <w:r>
+              <w:rPr>
+                <w:rFonts w:ascii="微软雅黑" w:hAnsi="微软雅黑" w:eastAsia="微软雅黑"/>
+                <w:b w:val="0"/>
+                <w:color w:val="1A1A1A"/>
+                <w:sz w:val="18"/>
+              </w:rPr>
+              <w:t>点研究并生成待确认大纲，或在页面上打开检索开关</w:t>
+            </w:r>
+          </w:p>
+        </w:tc>
+      </w:tr>
+      <w:tr>
+        <w:tc>
+          <w:tcPr>
+            <w:tcW w:type="dxa" w:w="2268"/>
+          </w:tcPr>
+          <w:p>
+            <w:pPr>
+              <w:spacing w:after="40"/>
+            </w:pPr>
+            <w:r/>
+            <w:r>
+              <w:rPr>
+                <w:rFonts w:ascii="微软雅黑" w:hAnsi="微软雅黑" w:eastAsia="微软雅黑"/>
+                <w:b w:val="0"/>
+                <w:color w:val="1A1A1A"/>
+                <w:sz w:val="18"/>
+              </w:rPr>
+              <w:t>上次调用的交付状态待核对</w:t>
+            </w:r>
+          </w:p>
+        </w:tc>
+        <w:tc>
+          <w:tcPr>
+            <w:tcW w:type="dxa" w:w="3969"/>
+          </w:tcPr>
+          <w:p>
+            <w:pPr>
+              <w:spacing w:after="40"/>
+            </w:pPr>
+            <w:r/>
+            <w:r>
+              <w:rPr>
+                <w:rFonts w:ascii="微软雅黑" w:hAnsi="微软雅黑" w:eastAsia="微软雅黑"/>
+                <w:b w:val="0"/>
+                <w:color w:val="1A1A1A"/>
+                <w:sz w:val="18"/>
+              </w:rPr>
+              <w:t>上游返回不确定，系统不敢替你重放付费请求</w:t>
+            </w:r>
+          </w:p>
+        </w:tc>
+        <w:tc>
+          <w:tcPr>
+            <w:tcW w:type="dxa" w:w="3402"/>
+          </w:tcPr>
+          <w:p>
+            <w:pPr>
+              <w:spacing w:after="40"/>
+            </w:pPr>
+            <w:r/>
+            <w:r>
+              <w:rPr>
+                <w:rFonts w:ascii="微软雅黑" w:hAnsi="微软雅黑" w:eastAsia="微软雅黑"/>
+                <w:b w:val="0"/>
+                <w:color w:val="1A1A1A"/>
+                <w:sz w:val="18"/>
+              </w:rPr>
+              <w:t>在日志页确认那一次调用状态，再点恢复</w:t>
+            </w:r>
+          </w:p>
+        </w:tc>
+      </w:tr>
+    </w:tbl>
+    <w:p>
+      <w:pPr>
+        <w:spacing w:after="40"/>
+      </w:pPr>
+    </w:p>
+    <w:p>
+      <w:pPr>
+        <w:pStyle w:val="Heading2"/>
+        <w:spacing w:before="240" w:after="120"/>
+      </w:pPr>
+      <w:r>
+        <w:rPr>
+          <w:rFonts w:ascii="微软雅黑" w:hAnsi="微软雅黑" w:eastAsia="微软雅黑"/>
+          <w:b/>
+          <w:color w:val="000000"/>
+          <w:sz w:val="25"/>
+        </w:rPr>
+        <w:t>钱花在哪、怎么不浪费</w:t>
+      </w:r>
+    </w:p>
+    <w:p>
+      <w:pPr>
+        <w:spacing w:after="120"/>
+      </w:pPr>
+      <w:r>
+        <w:rPr>
+          <w:rFonts w:ascii="微软雅黑" w:hAnsi="微软雅黑" w:eastAsia="微软雅黑"/>
+          <w:b w:val="0"/>
+          <w:color w:val="1A1A1A"/>
+          <w:sz w:val="21"/>
+        </w:rPr>
+        <w:t>一章的完整成本大致是：章节检索 1 次 + 证据抽取 1 次 + 4 段初稿 + 润色复核 + 验收 +（必要时）一次局部修订与复验。2026-09-24 实测：前 8 章累计约 66 美元，平均每章 8 美元上下，属于设计内的质量开销。同一次检索只要问法没变就直接复用已付费结果，不会因为重试再买一遍；草稿被压缩、验收被打回这类失败也不会重复购买检索。</w:t>
+      </w:r>
+    </w:p>
+    <w:p>
+      <w:pPr>
+        <w:pStyle w:val="Heading2"/>
+        <w:spacing w:before="240" w:after="120"/>
+      </w:pPr>
+      <w:r>
+        <w:rPr>
+          <w:rFonts w:ascii="微软雅黑" w:hAnsi="微软雅黑" w:eastAsia="微软雅黑"/>
+          <w:b/>
+          <w:color w:val="000000"/>
+          <w:sz w:val="25"/>
+        </w:rPr>
+        <w:t>怎么随时看进度（只读、不花钱）</w:t>
+      </w:r>
+    </w:p>
+    <w:p>
+      <w:pPr>
+        <w:spacing w:after="120"/>
+        <w:ind w:left="340"/>
+      </w:pPr>
+      <w:r>
+        <w:rPr>
+          <w:rFonts w:ascii="微软雅黑" w:hAnsi="微软雅黑" w:eastAsia="微软雅黑"/>
+          <w:b w:val="0"/>
+          <w:color w:val="1A1A1A"/>
+          <w:sz w:val="21"/>
+        </w:rPr>
+        <w:t>python .local\tmp\ssh_file.py .local\tmp\q_now3.sh</w:t>
+      </w:r>
+    </w:p>
+    <w:p>
+      <w:pPr>
+        <w:pStyle w:val="ListBullet"/>
+        <w:spacing w:after="60"/>
+      </w:pPr>
+      <w:r>
+        <w:rPr>
+          <w:rFonts w:ascii="微软雅黑" w:hAnsi="微软雅黑" w:eastAsia="微软雅黑"/>
+          <w:b w:val="0"/>
+          <w:color w:val="1A1A1A"/>
+          <w:sz w:val="21"/>
+        </w:rPr>
+        <w:t>看 phase 与每章 ACCEPTED 字数，判断推进到第几章；</w:t>
+      </w:r>
+    </w:p>
+    <w:p>
+      <w:pPr>
+        <w:pStyle w:val="ListBullet"/>
+        <w:spacing w:after="60"/>
+      </w:pPr>
+      <w:r>
+        <w:rPr>
+          <w:rFonts w:ascii="微软雅黑" w:hAnsi="微软雅黑" w:eastAsia="微软雅黑"/>
+          <w:b w:val="0"/>
+          <w:color w:val="1A1A1A"/>
+          <w:sz w:val="21"/>
+        </w:rPr>
+        <w:t>看 TOTAL_SPEND_USD，知道累计花到哪；</w:t>
+      </w:r>
+    </w:p>
+    <w:p>
+      <w:pPr>
+        <w:pStyle w:val="ListBullet"/>
+        <w:spacing w:after="60"/>
+      </w:pPr>
+      <w:r>
+        <w:rPr>
+          <w:rFonts w:ascii="微软雅黑" w:hAnsi="微软雅黑" w:eastAsia="微软雅黑"/>
+          <w:b w:val="0"/>
+          <w:color w:val="1A1A1A"/>
+          <w:sz w:val="21"/>
+        </w:rPr>
+        <w:t>看 task 与 active_run_id 这两行，确认现在是否真的在跑；</w:t>
+      </w:r>
+    </w:p>
+    <w:p>
+      <w:pPr>
+        <w:pStyle w:val="ListBullet"/>
+        <w:spacing w:after="60"/>
+      </w:pPr>
+      <w:r>
+        <w:rPr>
+          <w:rFonts w:ascii="微软雅黑" w:hAnsi="微软雅黑" w:eastAsia="微软雅黑"/>
+          <w:b w:val="0"/>
+          <w:color w:val="1A1A1A"/>
+          <w:sz w:val="21"/>
+        </w:rPr>
+        <w:t>看 /opt/auto_driver.log 与 /opt/auto_guard.log，读自动连跑每一步的决策与停机原因。</w:t>
+      </w:r>
+    </w:p>
+    <w:p>
+      <w:pPr>
+        <w:pStyle w:val="Heading2"/>
+        <w:spacing w:before="240" w:after="120"/>
+      </w:pPr>
+      <w:r>
+        <w:rPr>
+          <w:rFonts w:ascii="微软雅黑" w:hAnsi="微软雅黑" w:eastAsia="微软雅黑"/>
+          <w:b/>
+          <w:color w:val="000000"/>
+          <w:sz w:val="25"/>
+        </w:rPr>
+        <w:t>想暂停、想彻底停掉、想重新接上</w:t>
+      </w:r>
+    </w:p>
+    <w:tbl>
+      <w:tblPr>
+        <w:tblStyle w:val="TableGrid"/>
+        <w:tblW w:type="auto" w:w="0"/>
+        <w:jc w:val="center"/>
+        <w:tblLayout w:type="fixed"/>
+        <w:tblLook w:firstColumn="1" w:firstRow="1" w:lastColumn="0" w:lastRow="0" w:noHBand="0" w:noVBand="1" w:val="04A0"/>
+      </w:tblPr>
+      <w:tblGrid>
+        <w:gridCol w:w="4819"/>
+        <w:gridCol w:w="4819"/>
+      </w:tblGrid>
+      <w:tr>
+        <w:tc>
+          <w:tcPr>
+            <w:tcW w:type="dxa" w:w="2268"/>
+          </w:tcPr>
+          <w:p>
+            <w:pPr>
+              <w:spacing w:after="40"/>
+            </w:pPr>
+            <w:r/>
+            <w:r>
+              <w:rPr>
+                <w:rFonts w:ascii="微软雅黑" w:hAnsi="微软雅黑" w:eastAsia="微软雅黑"/>
+                <w:b/>
+                <w:color w:val="1A1A1A"/>
+                <w:sz w:val="18"/>
+              </w:rPr>
+              <w:t>意图</w:t>
+            </w:r>
+          </w:p>
+        </w:tc>
+        <w:tc>
+          <w:tcPr>
+            <w:tcW w:type="dxa" w:w="7370"/>
+          </w:tcPr>
+          <w:p>
+            <w:pPr>
+              <w:spacing w:after="40"/>
+            </w:pPr>
+            <w:r/>
+            <w:r>
+              <w:rPr>
+                <w:rFonts w:ascii="微软雅黑" w:hAnsi="微软雅黑" w:eastAsia="微软雅黑"/>
+                <w:b/>
+                <w:color w:val="1A1A1A"/>
+                <w:sz w:val="18"/>
+              </w:rPr>
+              <w:t>怎么做</w:t>
+            </w:r>
+          </w:p>
+        </w:tc>
+      </w:tr>
+      <w:tr>
+        <w:tc>
+          <w:tcPr>
+            <w:tcW w:type="dxa" w:w="2268"/>
+          </w:tcPr>
+          <w:p>
+            <w:pPr>
+              <w:spacing w:after="40"/>
+            </w:pPr>
+            <w:r/>
+            <w:r>
+              <w:rPr>
+                <w:rFonts w:ascii="微软雅黑" w:hAnsi="微软雅黑" w:eastAsia="微软雅黑"/>
+                <w:b w:val="0"/>
+                <w:color w:val="1A1A1A"/>
+                <w:sz w:val="18"/>
+              </w:rPr>
+              <w:t>临时停一下</w:t>
+            </w:r>
+          </w:p>
+        </w:tc>
+        <w:tc>
+          <w:tcPr>
+            <w:tcW w:type="dxa" w:w="7370"/>
+          </w:tcPr>
+          <w:p>
+            <w:pPr>
+              <w:spacing w:after="40"/>
+            </w:pPr>
+            <w:r/>
+            <w:r>
+              <w:rPr>
+                <w:rFonts w:ascii="微软雅黑" w:hAnsi="微软雅黑" w:eastAsia="微软雅黑"/>
+                <w:b w:val="0"/>
+                <w:color w:val="1A1A1A"/>
+                <w:sz w:val="18"/>
+              </w:rPr>
+              <w:t>在页面上点暂停。自动连跑只在空闲时提交，不会和你的操作打架</w:t>
+            </w:r>
+          </w:p>
+        </w:tc>
+      </w:tr>
+      <w:tr>
+        <w:tc>
+          <w:tcPr>
+            <w:tcW w:type="dxa" w:w="2268"/>
+          </w:tcPr>
+          <w:p>
+            <w:pPr>
+              <w:spacing w:after="40"/>
+            </w:pPr>
+            <w:r/>
+            <w:r>
+              <w:rPr>
+                <w:rFonts w:ascii="微软雅黑" w:hAnsi="微软雅黑" w:eastAsia="微软雅黑"/>
+                <w:b w:val="0"/>
+                <w:color w:val="1A1A1A"/>
+                <w:sz w:val="18"/>
+              </w:rPr>
+              <w:t>彻底停掉自动连跑</w:t>
+            </w:r>
+          </w:p>
+        </w:tc>
+        <w:tc>
+          <w:tcPr>
+            <w:tcW w:type="dxa" w:w="7370"/>
+          </w:tcPr>
+          <w:p>
+            <w:pPr>
+              <w:spacing w:after="40"/>
+            </w:pPr>
+            <w:r/>
+            <w:r>
+              <w:rPr>
+                <w:rFonts w:ascii="微软雅黑" w:hAnsi="微软雅黑" w:eastAsia="微软雅黑"/>
+                <w:b w:val="0"/>
+                <w:color w:val="1A1A1A"/>
+                <w:sz w:val="18"/>
+              </w:rPr>
+              <w:t>执行 pkill -f auto_guard 与 pkill -f auto_driver，或直接告诉我停掉自动连跑</w:t>
+            </w:r>
+          </w:p>
+        </w:tc>
+      </w:tr>
+      <w:tr>
+        <w:tc>
+          <w:tcPr>
+            <w:tcW w:type="dxa" w:w="2268"/>
+          </w:tcPr>
+          <w:p>
+            <w:pPr>
+              <w:spacing w:after="40"/>
+            </w:pPr>
+            <w:r/>
+            <w:r>
+              <w:rPr>
+                <w:rFonts w:ascii="微软雅黑" w:hAnsi="微软雅黑" w:eastAsia="微软雅黑"/>
+                <w:b w:val="0"/>
+                <w:color w:val="1A1A1A"/>
+                <w:sz w:val="18"/>
+              </w:rPr>
+              <w:t>重新接上</w:t>
+            </w:r>
+          </w:p>
+        </w:tc>
+        <w:tc>
+          <w:tcPr>
+            <w:tcW w:type="dxa" w:w="7370"/>
+          </w:tcPr>
+          <w:p>
+            <w:pPr>
+              <w:spacing w:after="40"/>
+            </w:pPr>
+            <w:r/>
+            <w:r>
+              <w:rPr>
+                <w:rFonts w:ascii="微软雅黑" w:hAnsi="微软雅黑" w:eastAsia="微软雅黑"/>
+                <w:b w:val="0"/>
+                <w:color w:val="1A1A1A"/>
+                <w:sz w:val="18"/>
+              </w:rPr>
+              <w:t>执行 bash /opt/gl_restart.sh，它会重拉守护脚本并打印进程号</w:t>
+            </w:r>
+          </w:p>
+        </w:tc>
+      </w:tr>
+      <w:tr>
+        <w:tc>
+          <w:tcPr>
+            <w:tcW w:type="dxa" w:w="2268"/>
+          </w:tcPr>
+          <w:p>
+            <w:pPr>
+              <w:spacing w:after="40"/>
+            </w:pPr>
+            <w:r/>
+            <w:r>
+              <w:rPr>
+                <w:rFonts w:ascii="微软雅黑" w:hAnsi="微软雅黑" w:eastAsia="微软雅黑"/>
+                <w:b w:val="0"/>
+                <w:color w:val="1A1A1A"/>
+                <w:sz w:val="18"/>
+              </w:rPr>
+              <w:t>换回人工点按钮</w:t>
+            </w:r>
+          </w:p>
+        </w:tc>
+        <w:tc>
+          <w:tcPr>
+            <w:tcW w:type="dxa" w:w="7370"/>
+          </w:tcPr>
+          <w:p>
+            <w:pPr>
+              <w:spacing w:after="40"/>
+            </w:pPr>
+            <w:r/>
+            <w:r>
+              <w:rPr>
+                <w:rFonts w:ascii="微软雅黑" w:hAnsi="微软雅黑" w:eastAsia="微软雅黑"/>
+                <w:b w:val="0"/>
+                <w:color w:val="1A1A1A"/>
+                <w:sz w:val="18"/>
+              </w:rPr>
+              <w:t>保持自动连跑下线即可；工作区的按钮与以前完全一样，一步都不会少</w:t>
+            </w:r>
+          </w:p>
+        </w:tc>
+      </w:tr>
+    </w:tbl>
+    <w:p>
+      <w:pPr>
+        <w:spacing w:after="40"/>
+      </w:pPr>
+    </w:p>
+    <w:p>
+      <w:pPr>
+        <w:pStyle w:val="Heading2"/>
+        <w:spacing w:before="240" w:after="120"/>
+      </w:pPr>
+      <w:r>
+        <w:rPr>
+          <w:rFonts w:ascii="微软雅黑" w:hAnsi="微软雅黑" w:eastAsia="微软雅黑"/>
+          <w:b/>
+          <w:color w:val="000000"/>
+          <w:sz w:val="25"/>
+        </w:rPr>
+        <w:t>新书第一次跑，会看到什么</w:t>
+      </w:r>
+    </w:p>
+    <w:p>
+      <w:pPr>
+        <w:spacing w:after="120"/>
+      </w:pPr>
+      <w:r>
+        <w:rPr>
+          <w:rFonts w:ascii="微软雅黑" w:hAnsi="微软雅黑" w:eastAsia="微软雅黑"/>
+          <w:b w:val="0"/>
+          <w:color w:val="1A1A1A"/>
+          <w:sz w:val="21"/>
+        </w:rPr>
+        <w:t>新书默认也会自动连跑：选题 → 大纲 → 自动确认推荐方案 → 逐章写作。如果你希望选题由自己拍板，就在研究并生成待确认大纲这一步之前把自动连跑停掉（上面那两行 pkill），自己选完、确认大纲，再 bash /opt/gl_restart.sh 接上。确认大纲之后的所有环节，交给服务端自动连跑即可。</w:t>
+      </w:r>
+    </w:p>
+    <w:p>
+      <w:pPr>
+        <w:pStyle w:val="Heading1"/>
+        <w:spacing w:before="260" w:after="160"/>
+      </w:pPr>
+      <w:r>
+        <w:rPr>
+          <w:rFonts w:ascii="微软雅黑" w:hAnsi="微软雅黑" w:eastAsia="微软雅黑"/>
+          <w:b/>
+          <w:color w:val="000000"/>
+          <w:sz w:val="30"/>
+        </w:rPr>
         <w:t>停顿处理总表</w:t>
       </w:r>
     </w:p>
@@ -4430,7 +5580,7 @@
           <w:color w:val="1A1A1A"/>
           <w:sz w:val="21"/>
         </w:rPr>
-        <w:t>自动连跑关掉页面会怎样？</w:t>
+        <w:t>页面上的自动连跑开关关了，它还会自己往下走吗？</w:t>
       </w:r>
     </w:p>
     <w:p>
@@ -4445,7 +5595,7 @@
           <w:color w:val="1A1A1A"/>
           <w:sz w:val="21"/>
         </w:rPr>
-        <w:t>停在当前断点，回来继续。它由页面驱动，不会在后台自行消耗费用。</w:t>
+        <w:t>会。从 2026-09-24 起往下走这件事由服务端守护脚本负责，页面开关保持关闭只是让出人工兜底入口，两条线用的是同一套动作接口与同一道验收门，不会因此少写一步或降低质量。</w:t>
       </w:r>
     </w:p>
     <w:p>
@@ -4508,6 +5658,35 @@
     </w:p>
     <w:p>
       <w:pPr>
+        <w:spacing w:after="40"/>
+      </w:pPr>
+      <w:r>
+        <w:rPr>
+          <w:rFonts w:ascii="微软雅黑" w:hAnsi="微软雅黑" w:eastAsia="微软雅黑"/>
+          <w:b/>
+          <w:color w:val="1A1A1A"/>
+          <w:sz w:val="21"/>
+        </w:rPr>
+        <w:t>服务端自动连跑和人工点按钮，出来的稿子会不一样吗？</w:t>
+      </w:r>
+    </w:p>
+    <w:p>
+      <w:pPr>
+        <w:spacing w:after="120"/>
+        <w:ind w:left="283"/>
+      </w:pPr>
+      <w:r>
+        <w:rPr>
+          <w:rFonts w:ascii="微软雅黑" w:hAnsi="微软雅黑" w:eastAsia="微软雅黑"/>
+          <w:b w:val="0"/>
+          <w:color w:val="1A1A1A"/>
+          <w:sz w:val="21"/>
+        </w:rPr>
+        <w:t>不会。它提交的是同一个动作、同一份 prompt、同一道验收门，区别只在于是谁按的按钮；它也不能做人工做不到的事，遇到需要判断的闸门一律停下来问人。</w:t>
+      </w:r>
+    </w:p>
+    <w:p>
+      <w:pPr>
         <w:pStyle w:val="Heading1"/>
         <w:spacing w:before="260" w:after="160"/>
       </w:pPr>
@@ -4547,7 +5726,7 @@
           <w:color w:val="1A1A1A"/>
           <w:sz w:val="20"/>
         </w:rPr>
-        <w:t>新建任务，分类选通用长篇，粘贴链接</w:t>
+        <w:t>新建任务，分类选通用长篇，粘贴参考链接（可选）</w:t>
       </w:r>
     </w:p>
     <w:p>
@@ -4562,7 +5741,7 @@
           <w:color w:val="1A1A1A"/>
           <w:sz w:val="20"/>
         </w:rPr>
-        <w:t>点研究并生成待确认大纲           [产生费用]</w:t>
+        <w:t>研究并生成待确认大纲              [服务端自动连跑会自己完成]</w:t>
       </w:r>
     </w:p>
     <w:p>
@@ -4577,7 +5756,7 @@
           <w:color w:val="1A1A1A"/>
           <w:sz w:val="20"/>
         </w:rPr>
-        <w:t>如被拦下，点按校验结果修复候选大纲   [一次局部修订]</w:t>
+        <w:t>被校验打回：按报告做一次局部修订   [一次局部修订，自动]</w:t>
       </w:r>
     </w:p>
     <w:p>
@@ -4592,7 +5771,7 @@
           <w:color w:val="1A1A1A"/>
           <w:sz w:val="20"/>
         </w:rPr>
-        <w:t>如仍有待核实材料，勾选直接采用联网检索结果</w:t>
+        <w:t>需要真实来源：选择直接采用检索结果或补齐材料</w:t>
       </w:r>
     </w:p>
     <w:p>
@@ -4607,7 +5786,7 @@
           <w:color w:val="1A1A1A"/>
           <w:sz w:val="20"/>
         </w:rPr>
-        <w:t>选方案后点确认选中包装与大纲         [不产生调用]</w:t>
+        <w:t>确认大纲                           [自动按推荐方案确认]</w:t>
       </w:r>
     </w:p>
     <w:p>
@@ -4622,7 +5801,7 @@
           <w:color w:val="1A1A1A"/>
           <w:sz w:val="20"/>
         </w:rPr>
-        <w:t>勾选自动连跑到成书，或逐章点研究并写作第 N 章</w:t>
+        <w:t>服务端自动连跑接管：第 1 章 → 第 13 章，每章验收通过后自动进入下一章</w:t>
       </w:r>
     </w:p>
     <w:p>
@@ -4637,7 +5816,7 @@
           <w:color w:val="1A1A1A"/>
           <w:sz w:val="20"/>
         </w:rPr>
-        <w:t>全部验收后自动或手动点全书终审与合稿 Word</w:t>
+        <w:t>全书终审与合稿：字数校验 + 两份 Word（每章一份、整本一份）</w:t>
       </w:r>
     </w:p>
     <w:p>
@@ -4652,7 +5831,7 @@
           <w:color w:val="1A1A1A"/>
           <w:sz w:val="20"/>
         </w:rPr>
-        <w:t>到文件页下载全书与两份文档</w:t>
+        <w:t>文件页下载成品文档                 [你唯一必须亲自做的两步：选题拍板 / 下载]</w:t>
       </w:r>
     </w:p>
     <w:p>
@@ -4803,7 +5982,7 @@
                 <w:color w:val="1A1A1A"/>
                 <w:sz w:val="18"/>
               </w:rPr>
-              <w:t>70409dd，包含来源策略开关、自动连跑与三处验收卡点的修复</w:t>
+              <w:t>2026-09-24（服务端自动连跑 v5 + 守护脚本、检索签名复用、生成上下文投影）</w:t>
             </w:r>
           </w:p>
         </w:tc>

</xml_diff>

<commit_message>
revert: restore application to September 23 baseline b69a088
</commit_message>
<xml_diff>
--- a/docs/通用长篇新书使用指南.docx
+++ b/docs/通用长篇新书使用指南.docx
@@ -42,7 +42,7 @@
           <w:color w:val="1A1A1A"/>
           <w:sz w:val="19"/>
         </w:rPr>
-        <w:t>本指南对应 2026-09-24 的线上版本：服务端自动连跑（v5 守护脚本）、检索签名复用、生成上下文投影。它讲的是从一条链接开始，到一整本十万字长篇完稿、拿到 Word 的全过程。</w:t>
+        <w:t>本指南对应线上版本 70409dd 的功能，包含来源策略开关、自动连跑，以及 2026-09-23 修好的三处验收卡点。</w:t>
       </w:r>
     </w:p>
     <w:p>
@@ -3181,1156 +3181,6 @@
           <w:color w:val="000000"/>
           <w:sz w:val="30"/>
         </w:rPr>
-        <w:t>第七步 服务端自动连跑（无人值守，推荐）</w:t>
-      </w:r>
-    </w:p>
-    <w:p>
-      <w:pPr>
-        <w:spacing w:after="120"/>
-      </w:pPr>
-      <w:r>
-        <w:rPr>
-          <w:rFonts w:ascii="微软雅黑" w:hAnsi="微软雅黑" w:eastAsia="微软雅黑"/>
-          <w:b w:val="0"/>
-          <w:color w:val="1A1A1A"/>
-          <w:sz w:val="21"/>
-        </w:rPr>
-        <w:t>从 2026-09-24 起，让它自己往下走这件事由服务端接管：ECS 上的守护脚本 /opt/auto_guard.sh 拉起 /opt/auto_driver.sh，在任务真正空闲时用与工作区按钮完全相同的动作接口提交下一步，逐章推进到第 13 章全部验收，再自动进入全书终审、字数校验与合稿 Word。页面上的自动连跑开关保持关闭即可：它现在只是人工兜底的备用入口，不再是整本书必须点开的东西。</w:t>
-      </w:r>
-    </w:p>
-    <w:p>
-      <w:pPr>
-        <w:pStyle w:val="Heading2"/>
-        <w:spacing w:before="240" w:after="120"/>
-      </w:pPr>
-      <w:r>
-        <w:rPr>
-          <w:rFonts w:ascii="微软雅黑" w:hAnsi="微软雅黑" w:eastAsia="微软雅黑"/>
-          <w:b/>
-          <w:color w:val="000000"/>
-          <w:sz w:val="25"/>
-        </w:rPr>
-        <w:t>它每一步做什么</w:t>
-      </w:r>
-    </w:p>
-    <w:p>
-      <w:pPr>
-        <w:pStyle w:val="ListNumber"/>
-        <w:spacing w:after="60"/>
-      </w:pPr>
-      <w:r>
-        <w:rPr>
-          <w:rFonts w:ascii="微软雅黑" w:hAnsi="微软雅黑" w:eastAsia="微软雅黑"/>
-          <w:b w:val="0"/>
-          <w:color w:val="1A1A1A"/>
-          <w:sz w:val="21"/>
-        </w:rPr>
-        <w:t>读状态：先确认任务空闲（pending / processing 一律当忙，绝不并发），并检查计费熔断开关。</w:t>
-      </w:r>
-    </w:p>
-    <w:p>
-      <w:pPr>
-        <w:pStyle w:val="ListNumber"/>
-        <w:spacing w:after="60"/>
-      </w:pPr>
-      <w:r>
-        <w:rPr>
-          <w:rFonts w:ascii="微软雅黑" w:hAnsi="微软雅黑" w:eastAsia="微软雅黑"/>
-          <w:b w:val="0"/>
-          <w:color w:val="1A1A1A"/>
-          <w:sz w:val="21"/>
-        </w:rPr>
-        <w:t>选题与大纲：需要联网检索时，按页面上允许自动重新联网检索的开关决定直接开检索，还是停下来等你点。</w:t>
-      </w:r>
-    </w:p>
-    <w:p>
-      <w:pPr>
-        <w:pStyle w:val="ListNumber"/>
-        <w:spacing w:after="60"/>
-      </w:pPr>
-      <w:r>
-        <w:rPr>
-          <w:rFonts w:ascii="微软雅黑" w:hAnsi="微软雅黑" w:eastAsia="微软雅黑"/>
-          <w:b w:val="0"/>
-          <w:color w:val="1A1A1A"/>
-          <w:sz w:val="21"/>
-        </w:rPr>
-        <w:t>确认大纲：结构校验通过后按推荐方案自动确认，不擅自改你选中的包装方案。</w:t>
-      </w:r>
-    </w:p>
-    <w:p>
-      <w:pPr>
-        <w:pStyle w:val="ListNumber"/>
-        <w:spacing w:after="60"/>
-      </w:pPr>
-      <w:r>
-        <w:rPr>
-          <w:rFonts w:ascii="微软雅黑" w:hAnsi="微软雅黑" w:eastAsia="微软雅黑"/>
-          <w:b w:val="0"/>
-          <w:color w:val="1A1A1A"/>
-          <w:sz w:val="21"/>
-        </w:rPr>
-        <w:t>逐章写作：第 N 章 → 章节检索 → 证据抽取 → 分小节初稿 → 润色复核 → 验收 →（有问题）一次局部修订 → 复验 → 通过后落盘 canon 状态 → 第 N+1 章。严格串行，任何时候只有一章在写。</w:t>
-      </w:r>
-    </w:p>
-    <w:p>
-      <w:pPr>
-        <w:pStyle w:val="ListNumber"/>
-        <w:spacing w:after="60"/>
-      </w:pPr>
-      <w:r>
-        <w:rPr>
-          <w:rFonts w:ascii="微软雅黑" w:hAnsi="微软雅黑" w:eastAsia="微软雅黑"/>
-          <w:b w:val="0"/>
-          <w:color w:val="1A1A1A"/>
-          <w:sz w:val="21"/>
-        </w:rPr>
-        <w:t>全书终审与合稿：13 章齐了以后跑终审；字数不在 100000—110000 或终审报了高/严重问题，会自动生成一次局部修订再复验，通过后输出整本 Word 与 manuscript.md。</w:t>
-      </w:r>
-    </w:p>
-    <w:p>
-      <w:pPr>
-        <w:pStyle w:val="Heading2"/>
-        <w:spacing w:before="240" w:after="120"/>
-      </w:pPr>
-      <w:r>
-        <w:rPr>
-          <w:rFonts w:ascii="微软雅黑" w:hAnsi="微软雅黑" w:eastAsia="微软雅黑"/>
-          <w:b/>
-          <w:color w:val="000000"/>
-          <w:sz w:val="25"/>
-        </w:rPr>
-        <w:t>三重安全阀：不会闷头烧钱</w:t>
-      </w:r>
-    </w:p>
-    <w:tbl>
-      <w:tblPr>
-        <w:tblStyle w:val="TableGrid"/>
-        <w:tblW w:type="auto" w:w="0"/>
-        <w:jc w:val="center"/>
-        <w:tblLayout w:type="fixed"/>
-        <w:tblLook w:firstColumn="1" w:firstRow="1" w:lastColumn="0" w:lastRow="0" w:noHBand="0" w:noVBand="1" w:val="04A0"/>
-      </w:tblPr>
-      <w:tblGrid>
-        <w:gridCol w:w="3213"/>
-        <w:gridCol w:w="3213"/>
-        <w:gridCol w:w="3213"/>
-      </w:tblGrid>
-      <w:tr>
-        <w:tc>
-          <w:tcPr>
-            <w:tcW w:type="dxa" w:w="1814"/>
-          </w:tcPr>
-          <w:p>
-            <w:pPr>
-              <w:spacing w:after="40"/>
-            </w:pPr>
-            <w:r/>
-            <w:r>
-              <w:rPr>
-                <w:rFonts w:ascii="微软雅黑" w:hAnsi="微软雅黑" w:eastAsia="微软雅黑"/>
-                <w:b/>
-                <w:color w:val="1A1A1A"/>
-                <w:sz w:val="18"/>
-              </w:rPr>
-              <w:t>安全阀</w:t>
-            </w:r>
-          </w:p>
-        </w:tc>
-        <w:tc>
-          <w:tcPr>
-            <w:tcW w:type="dxa" w:w="4762"/>
-          </w:tcPr>
-          <w:p>
-            <w:pPr>
-              <w:spacing w:after="40"/>
-            </w:pPr>
-            <w:r/>
-            <w:r>
-              <w:rPr>
-                <w:rFonts w:ascii="微软雅黑" w:hAnsi="微软雅黑" w:eastAsia="微软雅黑"/>
-                <w:b/>
-                <w:color w:val="1A1A1A"/>
-                <w:sz w:val="18"/>
-              </w:rPr>
-              <w:t>触发条件</w:t>
-            </w:r>
-          </w:p>
-        </w:tc>
-        <w:tc>
-          <w:tcPr>
-            <w:tcW w:type="dxa" w:w="3061"/>
-          </w:tcPr>
-          <w:p>
-            <w:pPr>
-              <w:spacing w:after="40"/>
-            </w:pPr>
-            <w:r/>
-            <w:r>
-              <w:rPr>
-                <w:rFonts w:ascii="微软雅黑" w:hAnsi="微软雅黑" w:eastAsia="微软雅黑"/>
-                <w:b/>
-                <w:color w:val="1A1A1A"/>
-                <w:sz w:val="18"/>
-              </w:rPr>
-              <w:t>它的动作</w:t>
-            </w:r>
-          </w:p>
-        </w:tc>
-      </w:tr>
-      <w:tr>
-        <w:tc>
-          <w:tcPr>
-            <w:tcW w:type="dxa" w:w="1814"/>
-          </w:tcPr>
-          <w:p>
-            <w:pPr>
-              <w:spacing w:after="40"/>
-            </w:pPr>
-            <w:r/>
-            <w:r>
-              <w:rPr>
-                <w:rFonts w:ascii="微软雅黑" w:hAnsi="微软雅黑" w:eastAsia="微软雅黑"/>
-                <w:b w:val="0"/>
-                <w:color w:val="1A1A1A"/>
-                <w:sz w:val="18"/>
-              </w:rPr>
-              <w:t>同一决策去重</w:t>
-            </w:r>
-          </w:p>
-        </w:tc>
-        <w:tc>
-          <w:tcPr>
-            <w:tcW w:type="dxa" w:w="4762"/>
-          </w:tcPr>
-          <w:p>
-            <w:pPr>
-              <w:spacing w:after="40"/>
-            </w:pPr>
-            <w:r/>
-            <w:r>
-              <w:rPr>
-                <w:rFonts w:ascii="微软雅黑" w:hAnsi="微软雅黑" w:eastAsia="微软雅黑"/>
-                <w:b w:val="0"/>
-                <w:color w:val="1A1A1A"/>
-                <w:sz w:val="18"/>
-              </w:rPr>
-              <w:t>连续 3 次算出同一动作且进度指纹毫无变化（没有任何新章通过验收）</w:t>
-            </w:r>
-          </w:p>
-        </w:tc>
-        <w:tc>
-          <w:tcPr>
-            <w:tcW w:type="dxa" w:w="3061"/>
-          </w:tcPr>
-          <w:p>
-            <w:pPr>
-              <w:spacing w:after="40"/>
-            </w:pPr>
-            <w:r/>
-            <w:r>
-              <w:rPr>
-                <w:rFonts w:ascii="微软雅黑" w:hAnsi="微软雅黑" w:eastAsia="微软雅黑"/>
-                <w:b w:val="0"/>
-                <w:color w:val="1A1A1A"/>
-                <w:sz w:val="18"/>
-              </w:rPr>
-              <w:t>立刻停机，不再提交，等人</w:t>
-            </w:r>
-          </w:p>
-        </w:tc>
-      </w:tr>
-      <w:tr>
-        <w:tc>
-          <w:tcPr>
-            <w:tcW w:type="dxa" w:w="1814"/>
-          </w:tcPr>
-          <w:p>
-            <w:pPr>
-              <w:spacing w:after="40"/>
-            </w:pPr>
-            <w:r/>
-            <w:r>
-              <w:rPr>
-                <w:rFonts w:ascii="微软雅黑" w:hAnsi="微软雅黑" w:eastAsia="微软雅黑"/>
-                <w:b w:val="0"/>
-                <w:color w:val="1A1A1A"/>
-                <w:sz w:val="18"/>
-              </w:rPr>
-              <w:t>无进展停机</w:t>
-            </w:r>
-          </w:p>
-        </w:tc>
-        <w:tc>
-          <w:tcPr>
-            <w:tcW w:type="dxa" w:w="4762"/>
-          </w:tcPr>
-          <w:p>
-            <w:pPr>
-              <w:spacing w:after="40"/>
-            </w:pPr>
-            <w:r/>
-            <w:r>
-              <w:rPr>
-                <w:rFonts w:ascii="微软雅黑" w:hAnsi="微软雅黑" w:eastAsia="微软雅黑"/>
-                <w:b w:val="0"/>
-                <w:color w:val="1A1A1A"/>
-                <w:sz w:val="18"/>
-              </w:rPr>
-              <w:t>连续 24 次付费步进仍没有新的章节通过验收（正常一章约 8—12 步）</w:t>
-            </w:r>
-          </w:p>
-        </w:tc>
-        <w:tc>
-          <w:tcPr>
-            <w:tcW w:type="dxa" w:w="3061"/>
-          </w:tcPr>
-          <w:p>
-            <w:pPr>
-              <w:spacing w:after="40"/>
-            </w:pPr>
-            <w:r/>
-            <w:r>
-              <w:rPr>
-                <w:rFonts w:ascii="微软雅黑" w:hAnsi="微软雅黑" w:eastAsia="微软雅黑"/>
-                <w:b w:val="0"/>
-                <w:color w:val="1A1A1A"/>
-                <w:sz w:val="18"/>
-              </w:rPr>
-              <w:t>立刻停机，等人</w:t>
-            </w:r>
-          </w:p>
-        </w:tc>
-      </w:tr>
-      <w:tr>
-        <w:tc>
-          <w:tcPr>
-            <w:tcW w:type="dxa" w:w="1814"/>
-          </w:tcPr>
-          <w:p>
-            <w:pPr>
-              <w:spacing w:after="40"/>
-            </w:pPr>
-            <w:r/>
-            <w:r>
-              <w:rPr>
-                <w:rFonts w:ascii="微软雅黑" w:hAnsi="微软雅黑" w:eastAsia="微软雅黑"/>
-                <w:b w:val="0"/>
-                <w:color w:val="1A1A1A"/>
-                <w:sz w:val="18"/>
-              </w:rPr>
-              <w:t>停机去重</w:t>
-            </w:r>
-          </w:p>
-        </w:tc>
-        <w:tc>
-          <w:tcPr>
-            <w:tcW w:type="dxa" w:w="4762"/>
-          </w:tcPr>
-          <w:p>
-            <w:pPr>
-              <w:spacing w:after="40"/>
-            </w:pPr>
-            <w:r/>
-            <w:r>
-              <w:rPr>
-                <w:rFonts w:ascii="微软雅黑" w:hAnsi="微软雅黑" w:eastAsia="微软雅黑"/>
-                <w:b w:val="0"/>
-                <w:color w:val="1A1A1A"/>
-                <w:sz w:val="18"/>
-              </w:rPr>
-              <w:t>守护脚本发现同样的停机信号连续出现两次</w:t>
-            </w:r>
-          </w:p>
-        </w:tc>
-        <w:tc>
-          <w:tcPr>
-            <w:tcW w:type="dxa" w:w="3061"/>
-          </w:tcPr>
-          <w:p>
-            <w:pPr>
-              <w:spacing w:after="40"/>
-            </w:pPr>
-            <w:r/>
-            <w:r>
-              <w:rPr>
-                <w:rFonts w:ascii="微软雅黑" w:hAnsi="微软雅黑" w:eastAsia="微软雅黑"/>
-                <w:b w:val="0"/>
-                <w:color w:val="1A1A1A"/>
-                <w:sz w:val="18"/>
-              </w:rPr>
-              <w:t>整个自动连跑下线，不再重启</w:t>
-            </w:r>
-          </w:p>
-        </w:tc>
-      </w:tr>
-    </w:tbl>
-    <w:p>
-      <w:pPr>
-        <w:spacing w:after="40"/>
-      </w:pPr>
-    </w:p>
-    <w:p>
-      <w:pPr>
-        <w:spacing w:after="160"/>
-      </w:pPr>
-      <w:r>
-        <w:rPr>
-          <w:rFonts w:ascii="微软雅黑" w:hAnsi="微软雅黑" w:eastAsia="微软雅黑"/>
-          <w:b w:val="0"/>
-          <w:color w:val="1A1A1A"/>
-          <w:sz w:val="21"/>
-        </w:rPr>
-        <w:t>三条阀都只会停，不会自动重放会花钱的请求。停机现场完好地留在 state.json 与 /opt/auto_driver.log 里，看一眼就能接着走。</w:t>
-      </w:r>
-    </w:p>
-    <w:p>
-      <w:pPr>
-        <w:pStyle w:val="Heading2"/>
-        <w:spacing w:before="240" w:after="120"/>
-      </w:pPr>
-      <w:r>
-        <w:rPr>
-          <w:rFonts w:ascii="微软雅黑" w:hAnsi="微软雅黑" w:eastAsia="微软雅黑"/>
-          <w:b/>
-          <w:color w:val="000000"/>
-          <w:sz w:val="25"/>
-        </w:rPr>
-        <w:t>停下来的时候，谁在等什么</w:t>
-      </w:r>
-    </w:p>
-    <w:tbl>
-      <w:tblPr>
-        <w:tblStyle w:val="TableGrid"/>
-        <w:tblW w:type="auto" w:w="0"/>
-        <w:jc w:val="center"/>
-        <w:tblLayout w:type="fixed"/>
-        <w:tblLook w:firstColumn="1" w:firstRow="1" w:lastColumn="0" w:lastRow="0" w:noHBand="0" w:noVBand="1" w:val="04A0"/>
-      </w:tblPr>
-      <w:tblGrid>
-        <w:gridCol w:w="3213"/>
-        <w:gridCol w:w="3213"/>
-        <w:gridCol w:w="3213"/>
-      </w:tblGrid>
-      <w:tr>
-        <w:tc>
-          <w:tcPr>
-            <w:tcW w:type="dxa" w:w="2268"/>
-          </w:tcPr>
-          <w:p>
-            <w:pPr>
-              <w:spacing w:after="40"/>
-            </w:pPr>
-            <w:r/>
-            <w:r>
-              <w:rPr>
-                <w:rFonts w:ascii="微软雅黑" w:hAnsi="微软雅黑" w:eastAsia="微软雅黑"/>
-                <w:b/>
-                <w:color w:val="1A1A1A"/>
-                <w:sz w:val="18"/>
-              </w:rPr>
-              <w:t>你看到的</w:t>
-            </w:r>
-          </w:p>
-        </w:tc>
-        <w:tc>
-          <w:tcPr>
-            <w:tcW w:type="dxa" w:w="3969"/>
-          </w:tcPr>
-          <w:p>
-            <w:pPr>
-              <w:spacing w:after="40"/>
-            </w:pPr>
-            <w:r/>
-            <w:r>
-              <w:rPr>
-                <w:rFonts w:ascii="微软雅黑" w:hAnsi="微软雅黑" w:eastAsia="微软雅黑"/>
-                <w:b/>
-                <w:color w:val="1A1A1A"/>
-                <w:sz w:val="18"/>
-              </w:rPr>
-              <w:t>真实含义</w:t>
-            </w:r>
-          </w:p>
-        </w:tc>
-        <w:tc>
-          <w:tcPr>
-            <w:tcW w:type="dxa" w:w="3402"/>
-          </w:tcPr>
-          <w:p>
-            <w:pPr>
-              <w:spacing w:after="40"/>
-            </w:pPr>
-            <w:r/>
-            <w:r>
-              <w:rPr>
-                <w:rFonts w:ascii="微软雅黑" w:hAnsi="微软雅黑" w:eastAsia="微软雅黑"/>
-                <w:b/>
-                <w:color w:val="1A1A1A"/>
-                <w:sz w:val="18"/>
-              </w:rPr>
-              <w:t>你要做的</w:t>
-            </w:r>
-          </w:p>
-        </w:tc>
-      </w:tr>
-      <w:tr>
-        <w:tc>
-          <w:tcPr>
-            <w:tcW w:type="dxa" w:w="2268"/>
-          </w:tcPr>
-          <w:p>
-            <w:pPr>
-              <w:spacing w:after="40"/>
-            </w:pPr>
-            <w:r/>
-            <w:r>
-              <w:rPr>
-                <w:rFonts w:ascii="微软雅黑" w:hAnsi="微软雅黑" w:eastAsia="微软雅黑"/>
-                <w:b w:val="0"/>
-                <w:color w:val="1A1A1A"/>
-                <w:sz w:val="18"/>
-              </w:rPr>
-              <w:t>同一决策重复，已停机</w:t>
-            </w:r>
-          </w:p>
-        </w:tc>
-        <w:tc>
-          <w:tcPr>
-            <w:tcW w:type="dxa" w:w="3969"/>
-          </w:tcPr>
-          <w:p>
-            <w:pPr>
-              <w:spacing w:after="40"/>
-            </w:pPr>
-            <w:r/>
-            <w:r>
-              <w:rPr>
-                <w:rFonts w:ascii="微软雅黑" w:hAnsi="微软雅黑" w:eastAsia="微软雅黑"/>
-                <w:b w:val="0"/>
-                <w:color w:val="1A1A1A"/>
-                <w:sz w:val="18"/>
-              </w:rPr>
-              <w:t>模型连续给出同一步而正文没有推进，通常是被同一条验收问题卡住</w:t>
-            </w:r>
-          </w:p>
-        </w:tc>
-        <w:tc>
-          <w:tcPr>
-            <w:tcW w:type="dxa" w:w="3402"/>
-          </w:tcPr>
-          <w:p>
-            <w:pPr>
-              <w:spacing w:after="40"/>
-            </w:pPr>
-            <w:r/>
-            <w:r>
-              <w:rPr>
-                <w:rFonts w:ascii="微软雅黑" w:hAnsi="微软雅黑" w:eastAsia="微软雅黑"/>
-                <w:b w:val="0"/>
-                <w:color w:val="1A1A1A"/>
-                <w:sz w:val="18"/>
-              </w:rPr>
-              <w:t>读一遍验收报告里那条问题，回我一句你的判断；或直接点一次局部修订</w:t>
-            </w:r>
-          </w:p>
-        </w:tc>
-      </w:tr>
-      <w:tr>
-        <w:tc>
-          <w:tcPr>
-            <w:tcW w:type="dxa" w:w="2268"/>
-          </w:tcPr>
-          <w:p>
-            <w:pPr>
-              <w:spacing w:after="40"/>
-            </w:pPr>
-            <w:r/>
-            <w:r>
-              <w:rPr>
-                <w:rFonts w:ascii="微软雅黑" w:hAnsi="微软雅黑" w:eastAsia="微软雅黑"/>
-                <w:b w:val="0"/>
-                <w:color w:val="1A1A1A"/>
-                <w:sz w:val="18"/>
-              </w:rPr>
-              <w:t>付费步进无进展，已停机</w:t>
-            </w:r>
-          </w:p>
-        </w:tc>
-        <w:tc>
-          <w:tcPr>
-            <w:tcW w:type="dxa" w:w="3969"/>
-          </w:tcPr>
-          <w:p>
-            <w:pPr>
-              <w:spacing w:after="40"/>
-            </w:pPr>
-            <w:r/>
-            <w:r>
-              <w:rPr>
-                <w:rFonts w:ascii="微软雅黑" w:hAnsi="微软雅黑" w:eastAsia="微软雅黑"/>
-                <w:b w:val="0"/>
-                <w:color w:val="1A1A1A"/>
-                <w:sz w:val="18"/>
-              </w:rPr>
-              <w:t>烧了 24 步还没写出一章，属于真卡死</w:t>
-            </w:r>
-          </w:p>
-        </w:tc>
-        <w:tc>
-          <w:tcPr>
-            <w:tcW w:type="dxa" w:w="3402"/>
-          </w:tcPr>
-          <w:p>
-            <w:pPr>
-              <w:spacing w:after="40"/>
-            </w:pPr>
-            <w:r/>
-            <w:r>
-              <w:rPr>
-                <w:rFonts w:ascii="微软雅黑" w:hAnsi="微软雅黑" w:eastAsia="微软雅黑"/>
-                <w:b w:val="0"/>
-                <w:color w:val="1A1A1A"/>
-                <w:sz w:val="18"/>
-              </w:rPr>
-              <w:t>回我一句看断点</w:t>
-            </w:r>
-          </w:p>
-        </w:tc>
-      </w:tr>
-      <w:tr>
-        <w:tc>
-          <w:tcPr>
-            <w:tcW w:type="dxa" w:w="2268"/>
-          </w:tcPr>
-          <w:p>
-            <w:pPr>
-              <w:spacing w:after="40"/>
-            </w:pPr>
-            <w:r/>
-            <w:r>
-              <w:rPr>
-                <w:rFonts w:ascii="微软雅黑" w:hAnsi="微软雅黑" w:eastAsia="微软雅黑"/>
-                <w:b w:val="0"/>
-                <w:color w:val="1A1A1A"/>
-                <w:sz w:val="18"/>
-              </w:rPr>
-              <w:t>需要一次新的全网检索</w:t>
-            </w:r>
-          </w:p>
-        </w:tc>
-        <w:tc>
-          <w:tcPr>
-            <w:tcW w:type="dxa" w:w="3969"/>
-          </w:tcPr>
-          <w:p>
-            <w:pPr>
-              <w:spacing w:after="40"/>
-            </w:pPr>
-            <w:r/>
-            <w:r>
-              <w:rPr>
-                <w:rFonts w:ascii="微软雅黑" w:hAnsi="微软雅黑" w:eastAsia="微软雅黑"/>
-                <w:b w:val="0"/>
-                <w:color w:val="1A1A1A"/>
-                <w:sz w:val="18"/>
-              </w:rPr>
-              <w:t>自动连跑没有检索权限，或断点里没有可复用的检索证据</w:t>
-            </w:r>
-          </w:p>
-        </w:tc>
-        <w:tc>
-          <w:tcPr>
-            <w:tcW w:type="dxa" w:w="3402"/>
-          </w:tcPr>
-          <w:p>
-            <w:pPr>
-              <w:spacing w:after="40"/>
-            </w:pPr>
-            <w:r/>
-            <w:r>
-              <w:rPr>
-                <w:rFonts w:ascii="微软雅黑" w:hAnsi="微软雅黑" w:eastAsia="微软雅黑"/>
-                <w:b w:val="0"/>
-                <w:color w:val="1A1A1A"/>
-                <w:sz w:val="18"/>
-              </w:rPr>
-              <w:t>点研究并生成待确认大纲，或在页面上打开检索开关</w:t>
-            </w:r>
-          </w:p>
-        </w:tc>
-      </w:tr>
-      <w:tr>
-        <w:tc>
-          <w:tcPr>
-            <w:tcW w:type="dxa" w:w="2268"/>
-          </w:tcPr>
-          <w:p>
-            <w:pPr>
-              <w:spacing w:after="40"/>
-            </w:pPr>
-            <w:r/>
-            <w:r>
-              <w:rPr>
-                <w:rFonts w:ascii="微软雅黑" w:hAnsi="微软雅黑" w:eastAsia="微软雅黑"/>
-                <w:b w:val="0"/>
-                <w:color w:val="1A1A1A"/>
-                <w:sz w:val="18"/>
-              </w:rPr>
-              <w:t>上次调用的交付状态待核对</w:t>
-            </w:r>
-          </w:p>
-        </w:tc>
-        <w:tc>
-          <w:tcPr>
-            <w:tcW w:type="dxa" w:w="3969"/>
-          </w:tcPr>
-          <w:p>
-            <w:pPr>
-              <w:spacing w:after="40"/>
-            </w:pPr>
-            <w:r/>
-            <w:r>
-              <w:rPr>
-                <w:rFonts w:ascii="微软雅黑" w:hAnsi="微软雅黑" w:eastAsia="微软雅黑"/>
-                <w:b w:val="0"/>
-                <w:color w:val="1A1A1A"/>
-                <w:sz w:val="18"/>
-              </w:rPr>
-              <w:t>上游返回不确定，系统不敢替你重放付费请求</w:t>
-            </w:r>
-          </w:p>
-        </w:tc>
-        <w:tc>
-          <w:tcPr>
-            <w:tcW w:type="dxa" w:w="3402"/>
-          </w:tcPr>
-          <w:p>
-            <w:pPr>
-              <w:spacing w:after="40"/>
-            </w:pPr>
-            <w:r/>
-            <w:r>
-              <w:rPr>
-                <w:rFonts w:ascii="微软雅黑" w:hAnsi="微软雅黑" w:eastAsia="微软雅黑"/>
-                <w:b w:val="0"/>
-                <w:color w:val="1A1A1A"/>
-                <w:sz w:val="18"/>
-              </w:rPr>
-              <w:t>在日志页确认那一次调用状态，再点恢复</w:t>
-            </w:r>
-          </w:p>
-        </w:tc>
-      </w:tr>
-    </w:tbl>
-    <w:p>
-      <w:pPr>
-        <w:spacing w:after="40"/>
-      </w:pPr>
-    </w:p>
-    <w:p>
-      <w:pPr>
-        <w:pStyle w:val="Heading2"/>
-        <w:spacing w:before="240" w:after="120"/>
-      </w:pPr>
-      <w:r>
-        <w:rPr>
-          <w:rFonts w:ascii="微软雅黑" w:hAnsi="微软雅黑" w:eastAsia="微软雅黑"/>
-          <w:b/>
-          <w:color w:val="000000"/>
-          <w:sz w:val="25"/>
-        </w:rPr>
-        <w:t>钱花在哪、怎么不浪费</w:t>
-      </w:r>
-    </w:p>
-    <w:p>
-      <w:pPr>
-        <w:spacing w:after="120"/>
-      </w:pPr>
-      <w:r>
-        <w:rPr>
-          <w:rFonts w:ascii="微软雅黑" w:hAnsi="微软雅黑" w:eastAsia="微软雅黑"/>
-          <w:b w:val="0"/>
-          <w:color w:val="1A1A1A"/>
-          <w:sz w:val="21"/>
-        </w:rPr>
-        <w:t>一章的完整成本大致是：章节检索 1 次 + 证据抽取 1 次 + 4 段初稿 + 润色复核 + 验收 +（必要时）一次局部修订与复验。2026-09-24 实测：前 8 章累计约 66 美元，平均每章 8 美元上下，属于设计内的质量开销。同一次检索只要问法没变就直接复用已付费结果，不会因为重试再买一遍；草稿被压缩、验收被打回这类失败也不会重复购买检索。</w:t>
-      </w:r>
-    </w:p>
-    <w:p>
-      <w:pPr>
-        <w:pStyle w:val="Heading2"/>
-        <w:spacing w:before="240" w:after="120"/>
-      </w:pPr>
-      <w:r>
-        <w:rPr>
-          <w:rFonts w:ascii="微软雅黑" w:hAnsi="微软雅黑" w:eastAsia="微软雅黑"/>
-          <w:b/>
-          <w:color w:val="000000"/>
-          <w:sz w:val="25"/>
-        </w:rPr>
-        <w:t>怎么随时看进度（只读、不花钱）</w:t>
-      </w:r>
-    </w:p>
-    <w:p>
-      <w:pPr>
-        <w:spacing w:after="120"/>
-        <w:ind w:left="340"/>
-      </w:pPr>
-      <w:r>
-        <w:rPr>
-          <w:rFonts w:ascii="微软雅黑" w:hAnsi="微软雅黑" w:eastAsia="微软雅黑"/>
-          <w:b w:val="0"/>
-          <w:color w:val="1A1A1A"/>
-          <w:sz w:val="21"/>
-        </w:rPr>
-        <w:t>python .local\tmp\ssh_file.py .local\tmp\q_now3.sh</w:t>
-      </w:r>
-    </w:p>
-    <w:p>
-      <w:pPr>
-        <w:pStyle w:val="ListBullet"/>
-        <w:spacing w:after="60"/>
-      </w:pPr>
-      <w:r>
-        <w:rPr>
-          <w:rFonts w:ascii="微软雅黑" w:hAnsi="微软雅黑" w:eastAsia="微软雅黑"/>
-          <w:b w:val="0"/>
-          <w:color w:val="1A1A1A"/>
-          <w:sz w:val="21"/>
-        </w:rPr>
-        <w:t>看 phase 与每章 ACCEPTED 字数，判断推进到第几章；</w:t>
-      </w:r>
-    </w:p>
-    <w:p>
-      <w:pPr>
-        <w:pStyle w:val="ListBullet"/>
-        <w:spacing w:after="60"/>
-      </w:pPr>
-      <w:r>
-        <w:rPr>
-          <w:rFonts w:ascii="微软雅黑" w:hAnsi="微软雅黑" w:eastAsia="微软雅黑"/>
-          <w:b w:val="0"/>
-          <w:color w:val="1A1A1A"/>
-          <w:sz w:val="21"/>
-        </w:rPr>
-        <w:t>看 TOTAL_SPEND_USD，知道累计花到哪；</w:t>
-      </w:r>
-    </w:p>
-    <w:p>
-      <w:pPr>
-        <w:pStyle w:val="ListBullet"/>
-        <w:spacing w:after="60"/>
-      </w:pPr>
-      <w:r>
-        <w:rPr>
-          <w:rFonts w:ascii="微软雅黑" w:hAnsi="微软雅黑" w:eastAsia="微软雅黑"/>
-          <w:b w:val="0"/>
-          <w:color w:val="1A1A1A"/>
-          <w:sz w:val="21"/>
-        </w:rPr>
-        <w:t>看 task 与 active_run_id 这两行，确认现在是否真的在跑；</w:t>
-      </w:r>
-    </w:p>
-    <w:p>
-      <w:pPr>
-        <w:pStyle w:val="ListBullet"/>
-        <w:spacing w:after="60"/>
-      </w:pPr>
-      <w:r>
-        <w:rPr>
-          <w:rFonts w:ascii="微软雅黑" w:hAnsi="微软雅黑" w:eastAsia="微软雅黑"/>
-          <w:b w:val="0"/>
-          <w:color w:val="1A1A1A"/>
-          <w:sz w:val="21"/>
-        </w:rPr>
-        <w:t>看 /opt/auto_driver.log 与 /opt/auto_guard.log，读自动连跑每一步的决策与停机原因。</w:t>
-      </w:r>
-    </w:p>
-    <w:p>
-      <w:pPr>
-        <w:pStyle w:val="Heading2"/>
-        <w:spacing w:before="240" w:after="120"/>
-      </w:pPr>
-      <w:r>
-        <w:rPr>
-          <w:rFonts w:ascii="微软雅黑" w:hAnsi="微软雅黑" w:eastAsia="微软雅黑"/>
-          <w:b/>
-          <w:color w:val="000000"/>
-          <w:sz w:val="25"/>
-        </w:rPr>
-        <w:t>想暂停、想彻底停掉、想重新接上</w:t>
-      </w:r>
-    </w:p>
-    <w:tbl>
-      <w:tblPr>
-        <w:tblStyle w:val="TableGrid"/>
-        <w:tblW w:type="auto" w:w="0"/>
-        <w:jc w:val="center"/>
-        <w:tblLayout w:type="fixed"/>
-        <w:tblLook w:firstColumn="1" w:firstRow="1" w:lastColumn="0" w:lastRow="0" w:noHBand="0" w:noVBand="1" w:val="04A0"/>
-      </w:tblPr>
-      <w:tblGrid>
-        <w:gridCol w:w="4819"/>
-        <w:gridCol w:w="4819"/>
-      </w:tblGrid>
-      <w:tr>
-        <w:tc>
-          <w:tcPr>
-            <w:tcW w:type="dxa" w:w="2268"/>
-          </w:tcPr>
-          <w:p>
-            <w:pPr>
-              <w:spacing w:after="40"/>
-            </w:pPr>
-            <w:r/>
-            <w:r>
-              <w:rPr>
-                <w:rFonts w:ascii="微软雅黑" w:hAnsi="微软雅黑" w:eastAsia="微软雅黑"/>
-                <w:b/>
-                <w:color w:val="1A1A1A"/>
-                <w:sz w:val="18"/>
-              </w:rPr>
-              <w:t>意图</w:t>
-            </w:r>
-          </w:p>
-        </w:tc>
-        <w:tc>
-          <w:tcPr>
-            <w:tcW w:type="dxa" w:w="7370"/>
-          </w:tcPr>
-          <w:p>
-            <w:pPr>
-              <w:spacing w:after="40"/>
-            </w:pPr>
-            <w:r/>
-            <w:r>
-              <w:rPr>
-                <w:rFonts w:ascii="微软雅黑" w:hAnsi="微软雅黑" w:eastAsia="微软雅黑"/>
-                <w:b/>
-                <w:color w:val="1A1A1A"/>
-                <w:sz w:val="18"/>
-              </w:rPr>
-              <w:t>怎么做</w:t>
-            </w:r>
-          </w:p>
-        </w:tc>
-      </w:tr>
-      <w:tr>
-        <w:tc>
-          <w:tcPr>
-            <w:tcW w:type="dxa" w:w="2268"/>
-          </w:tcPr>
-          <w:p>
-            <w:pPr>
-              <w:spacing w:after="40"/>
-            </w:pPr>
-            <w:r/>
-            <w:r>
-              <w:rPr>
-                <w:rFonts w:ascii="微软雅黑" w:hAnsi="微软雅黑" w:eastAsia="微软雅黑"/>
-                <w:b w:val="0"/>
-                <w:color w:val="1A1A1A"/>
-                <w:sz w:val="18"/>
-              </w:rPr>
-              <w:t>临时停一下</w:t>
-            </w:r>
-          </w:p>
-        </w:tc>
-        <w:tc>
-          <w:tcPr>
-            <w:tcW w:type="dxa" w:w="7370"/>
-          </w:tcPr>
-          <w:p>
-            <w:pPr>
-              <w:spacing w:after="40"/>
-            </w:pPr>
-            <w:r/>
-            <w:r>
-              <w:rPr>
-                <w:rFonts w:ascii="微软雅黑" w:hAnsi="微软雅黑" w:eastAsia="微软雅黑"/>
-                <w:b w:val="0"/>
-                <w:color w:val="1A1A1A"/>
-                <w:sz w:val="18"/>
-              </w:rPr>
-              <w:t>在页面上点暂停。自动连跑只在空闲时提交，不会和你的操作打架</w:t>
-            </w:r>
-          </w:p>
-        </w:tc>
-      </w:tr>
-      <w:tr>
-        <w:tc>
-          <w:tcPr>
-            <w:tcW w:type="dxa" w:w="2268"/>
-          </w:tcPr>
-          <w:p>
-            <w:pPr>
-              <w:spacing w:after="40"/>
-            </w:pPr>
-            <w:r/>
-            <w:r>
-              <w:rPr>
-                <w:rFonts w:ascii="微软雅黑" w:hAnsi="微软雅黑" w:eastAsia="微软雅黑"/>
-                <w:b w:val="0"/>
-                <w:color w:val="1A1A1A"/>
-                <w:sz w:val="18"/>
-              </w:rPr>
-              <w:t>彻底停掉自动连跑</w:t>
-            </w:r>
-          </w:p>
-        </w:tc>
-        <w:tc>
-          <w:tcPr>
-            <w:tcW w:type="dxa" w:w="7370"/>
-          </w:tcPr>
-          <w:p>
-            <w:pPr>
-              <w:spacing w:after="40"/>
-            </w:pPr>
-            <w:r/>
-            <w:r>
-              <w:rPr>
-                <w:rFonts w:ascii="微软雅黑" w:hAnsi="微软雅黑" w:eastAsia="微软雅黑"/>
-                <w:b w:val="0"/>
-                <w:color w:val="1A1A1A"/>
-                <w:sz w:val="18"/>
-              </w:rPr>
-              <w:t>执行 pkill -f auto_guard 与 pkill -f auto_driver，或直接告诉我停掉自动连跑</w:t>
-            </w:r>
-          </w:p>
-        </w:tc>
-      </w:tr>
-      <w:tr>
-        <w:tc>
-          <w:tcPr>
-            <w:tcW w:type="dxa" w:w="2268"/>
-          </w:tcPr>
-          <w:p>
-            <w:pPr>
-              <w:spacing w:after="40"/>
-            </w:pPr>
-            <w:r/>
-            <w:r>
-              <w:rPr>
-                <w:rFonts w:ascii="微软雅黑" w:hAnsi="微软雅黑" w:eastAsia="微软雅黑"/>
-                <w:b w:val="0"/>
-                <w:color w:val="1A1A1A"/>
-                <w:sz w:val="18"/>
-              </w:rPr>
-              <w:t>重新接上</w:t>
-            </w:r>
-          </w:p>
-        </w:tc>
-        <w:tc>
-          <w:tcPr>
-            <w:tcW w:type="dxa" w:w="7370"/>
-          </w:tcPr>
-          <w:p>
-            <w:pPr>
-              <w:spacing w:after="40"/>
-            </w:pPr>
-            <w:r/>
-            <w:r>
-              <w:rPr>
-                <w:rFonts w:ascii="微软雅黑" w:hAnsi="微软雅黑" w:eastAsia="微软雅黑"/>
-                <w:b w:val="0"/>
-                <w:color w:val="1A1A1A"/>
-                <w:sz w:val="18"/>
-              </w:rPr>
-              <w:t>执行 bash /opt/gl_restart.sh，它会重拉守护脚本并打印进程号</w:t>
-            </w:r>
-          </w:p>
-        </w:tc>
-      </w:tr>
-      <w:tr>
-        <w:tc>
-          <w:tcPr>
-            <w:tcW w:type="dxa" w:w="2268"/>
-          </w:tcPr>
-          <w:p>
-            <w:pPr>
-              <w:spacing w:after="40"/>
-            </w:pPr>
-            <w:r/>
-            <w:r>
-              <w:rPr>
-                <w:rFonts w:ascii="微软雅黑" w:hAnsi="微软雅黑" w:eastAsia="微软雅黑"/>
-                <w:b w:val="0"/>
-                <w:color w:val="1A1A1A"/>
-                <w:sz w:val="18"/>
-              </w:rPr>
-              <w:t>换回人工点按钮</w:t>
-            </w:r>
-          </w:p>
-        </w:tc>
-        <w:tc>
-          <w:tcPr>
-            <w:tcW w:type="dxa" w:w="7370"/>
-          </w:tcPr>
-          <w:p>
-            <w:pPr>
-              <w:spacing w:after="40"/>
-            </w:pPr>
-            <w:r/>
-            <w:r>
-              <w:rPr>
-                <w:rFonts w:ascii="微软雅黑" w:hAnsi="微软雅黑" w:eastAsia="微软雅黑"/>
-                <w:b w:val="0"/>
-                <w:color w:val="1A1A1A"/>
-                <w:sz w:val="18"/>
-              </w:rPr>
-              <w:t>保持自动连跑下线即可；工作区的按钮与以前完全一样，一步都不会少</w:t>
-            </w:r>
-          </w:p>
-        </w:tc>
-      </w:tr>
-    </w:tbl>
-    <w:p>
-      <w:pPr>
-        <w:spacing w:after="40"/>
-      </w:pPr>
-    </w:p>
-    <w:p>
-      <w:pPr>
-        <w:pStyle w:val="Heading2"/>
-        <w:spacing w:before="240" w:after="120"/>
-      </w:pPr>
-      <w:r>
-        <w:rPr>
-          <w:rFonts w:ascii="微软雅黑" w:hAnsi="微软雅黑" w:eastAsia="微软雅黑"/>
-          <w:b/>
-          <w:color w:val="000000"/>
-          <w:sz w:val="25"/>
-        </w:rPr>
-        <w:t>新书第一次跑，会看到什么</w:t>
-      </w:r>
-    </w:p>
-    <w:p>
-      <w:pPr>
-        <w:spacing w:after="120"/>
-      </w:pPr>
-      <w:r>
-        <w:rPr>
-          <w:rFonts w:ascii="微软雅黑" w:hAnsi="微软雅黑" w:eastAsia="微软雅黑"/>
-          <w:b w:val="0"/>
-          <w:color w:val="1A1A1A"/>
-          <w:sz w:val="21"/>
-        </w:rPr>
-        <w:t>新书默认也会自动连跑：选题 → 大纲 → 自动确认推荐方案 → 逐章写作。如果你希望选题由自己拍板，就在研究并生成待确认大纲这一步之前把自动连跑停掉（上面那两行 pkill），自己选完、确认大纲，再 bash /opt/gl_restart.sh 接上。确认大纲之后的所有环节，交给服务端自动连跑即可。</w:t>
-      </w:r>
-    </w:p>
-    <w:p>
-      <w:pPr>
-        <w:pStyle w:val="Heading1"/>
-        <w:spacing w:before="260" w:after="160"/>
-      </w:pPr>
-      <w:r>
-        <w:rPr>
-          <w:rFonts w:ascii="微软雅黑" w:hAnsi="微软雅黑" w:eastAsia="微软雅黑"/>
-          <w:b/>
-          <w:color w:val="000000"/>
-          <w:sz w:val="30"/>
-        </w:rPr>
         <w:t>停顿处理总表</w:t>
       </w:r>
     </w:p>
@@ -5580,7 +4430,7 @@
           <w:color w:val="1A1A1A"/>
           <w:sz w:val="21"/>
         </w:rPr>
-        <w:t>页面上的自动连跑开关关了，它还会自己往下走吗？</w:t>
+        <w:t>自动连跑关掉页面会怎样？</w:t>
       </w:r>
     </w:p>
     <w:p>
@@ -5595,7 +4445,7 @@
           <w:color w:val="1A1A1A"/>
           <w:sz w:val="21"/>
         </w:rPr>
-        <w:t>会。从 2026-09-24 起往下走这件事由服务端守护脚本负责，页面开关保持关闭只是让出人工兜底入口，两条线用的是同一套动作接口与同一道验收门，不会因此少写一步或降低质量。</w:t>
+        <w:t>停在当前断点，回来继续。它由页面驱动，不会在后台自行消耗费用。</w:t>
       </w:r>
     </w:p>
     <w:p>
@@ -5658,35 +4508,6 @@
     </w:p>
     <w:p>
       <w:pPr>
-        <w:spacing w:after="40"/>
-      </w:pPr>
-      <w:r>
-        <w:rPr>
-          <w:rFonts w:ascii="微软雅黑" w:hAnsi="微软雅黑" w:eastAsia="微软雅黑"/>
-          <w:b/>
-          <w:color w:val="1A1A1A"/>
-          <w:sz w:val="21"/>
-        </w:rPr>
-        <w:t>服务端自动连跑和人工点按钮，出来的稿子会不一样吗？</w:t>
-      </w:r>
-    </w:p>
-    <w:p>
-      <w:pPr>
-        <w:spacing w:after="120"/>
-        <w:ind w:left="283"/>
-      </w:pPr>
-      <w:r>
-        <w:rPr>
-          <w:rFonts w:ascii="微软雅黑" w:hAnsi="微软雅黑" w:eastAsia="微软雅黑"/>
-          <w:b w:val="0"/>
-          <w:color w:val="1A1A1A"/>
-          <w:sz w:val="21"/>
-        </w:rPr>
-        <w:t>不会。它提交的是同一个动作、同一份 prompt、同一道验收门，区别只在于是谁按的按钮；它也不能做人工做不到的事，遇到需要判断的闸门一律停下来问人。</w:t>
-      </w:r>
-    </w:p>
-    <w:p>
-      <w:pPr>
         <w:pStyle w:val="Heading1"/>
         <w:spacing w:before="260" w:after="160"/>
       </w:pPr>
@@ -5726,7 +4547,7 @@
           <w:color w:val="1A1A1A"/>
           <w:sz w:val="20"/>
         </w:rPr>
-        <w:t>新建任务，分类选通用长篇，粘贴参考链接（可选）</w:t>
+        <w:t>新建任务，分类选通用长篇，粘贴链接</w:t>
       </w:r>
     </w:p>
     <w:p>
@@ -5741,7 +4562,7 @@
           <w:color w:val="1A1A1A"/>
           <w:sz w:val="20"/>
         </w:rPr>
-        <w:t>研究并生成待确认大纲              [服务端自动连跑会自己完成]</w:t>
+        <w:t>点研究并生成待确认大纲           [产生费用]</w:t>
       </w:r>
     </w:p>
     <w:p>
@@ -5756,7 +4577,7 @@
           <w:color w:val="1A1A1A"/>
           <w:sz w:val="20"/>
         </w:rPr>
-        <w:t>被校验打回：按报告做一次局部修订   [一次局部修订，自动]</w:t>
+        <w:t>如被拦下，点按校验结果修复候选大纲   [一次局部修订]</w:t>
       </w:r>
     </w:p>
     <w:p>
@@ -5771,7 +4592,7 @@
           <w:color w:val="1A1A1A"/>
           <w:sz w:val="20"/>
         </w:rPr>
-        <w:t>需要真实来源：选择直接采用检索结果或补齐材料</w:t>
+        <w:t>如仍有待核实材料，勾选直接采用联网检索结果</w:t>
       </w:r>
     </w:p>
     <w:p>
@@ -5786,7 +4607,7 @@
           <w:color w:val="1A1A1A"/>
           <w:sz w:val="20"/>
         </w:rPr>
-        <w:t>确认大纲                           [自动按推荐方案确认]</w:t>
+        <w:t>选方案后点确认选中包装与大纲         [不产生调用]</w:t>
       </w:r>
     </w:p>
     <w:p>
@@ -5801,7 +4622,7 @@
           <w:color w:val="1A1A1A"/>
           <w:sz w:val="20"/>
         </w:rPr>
-        <w:t>服务端自动连跑接管：第 1 章 → 第 13 章，每章验收通过后自动进入下一章</w:t>
+        <w:t>勾选自动连跑到成书，或逐章点研究并写作第 N 章</w:t>
       </w:r>
     </w:p>
     <w:p>
@@ -5816,7 +4637,7 @@
           <w:color w:val="1A1A1A"/>
           <w:sz w:val="20"/>
         </w:rPr>
-        <w:t>全书终审与合稿：字数校验 + 两份 Word（每章一份、整本一份）</w:t>
+        <w:t>全部验收后自动或手动点全书终审与合稿 Word</w:t>
       </w:r>
     </w:p>
     <w:p>
@@ -5831,7 +4652,7 @@
           <w:color w:val="1A1A1A"/>
           <w:sz w:val="20"/>
         </w:rPr>
-        <w:t>文件页下载成品文档                 [你唯一必须亲自做的两步：选题拍板 / 下载]</w:t>
+        <w:t>到文件页下载全书与两份文档</w:t>
       </w:r>
     </w:p>
     <w:p>
@@ -5982,7 +4803,7 @@
                 <w:color w:val="1A1A1A"/>
                 <w:sz w:val="18"/>
               </w:rPr>
-              <w:t>2026-09-24（服务端自动连跑 v5 + 守护脚本、检索签名复用、生成上下文投影）</w:t>
+              <w:t>70409dd，包含来源策略开关、自动连跑与三处验收卡点的修复</w:t>
             </w:r>
           </w:p>
         </w:tc>

</xml_diff>